<commit_message>
Revert chapter titles to noun form per 공무원 보고서 convention (drop question-form headings)
- 기획서: 장·절 제목과 요약 항목·기대효과 머리말을 질문형/구어체에서 명사형 개조식으로 환원
  (예: '왜 이 사업이 필요한가'→'사업 배경 및 필요성'), 본문 쉬운 말·압축은 유지
- skill.md: 독자 원칙에 '제목은 명사형 유지' 항목 추가 — 평이화는 본문에만 적용, 제목은 개조식
</commit_message>
<xml_diff>
--- a/기획서/강제동원_통합DB_아카이브넷_구축_기획서.docx
+++ b/기획서/강제동원_통합DB_아카이브넷_구축_기획서.docx
@@ -293,19 +293,19 @@
           <w:color w:val="2C3E50"/>
           <w:sz w:val="17"/>
         </w:rPr>
-        <w:t>Ⅰ. 왜 이 사업이 필요한가 (배경 및 필요성)</w:t>
+        <w:t>Ⅰ. 사업 배경 및 필요성</w:t>
         <w:br/>
-        <w:t>Ⅱ. 무엇을 모으는가 (대상 자료와 수집 계획)</w:t>
+        <w:t>Ⅱ. 아카이빙 대상 자료 현황 및 수집 계획</w:t>
         <w:br/>
-        <w:t>Ⅲ. 어떻게 만드는가 (기술 구현 방향)</w:t>
+        <w:t>Ⅲ. 기술 구현 방향 및 시스템 설계</w:t>
         <w:br/>
-        <w:t>Ⅳ. 언제, 얼마로 하는가 (로드맵과 예산)</w:t>
+        <w:t>Ⅳ. 추진 로드맵 및 예산 계획</w:t>
         <w:br/>
-        <w:t>Ⅴ. 누가 추진하는가 (추진 체계와 소관 부처)</w:t>
+        <w:t>Ⅴ. 사업 추진 체계 및 소관 부처·산하기관 분석</w:t>
         <w:br/>
-        <w:t>Ⅵ. 누구와 협력하는가 (협력 체계)</w:t>
+        <w:t>Ⅵ. 협력 체계 구축 방안</w:t>
         <w:br/>
-        <w:t>Ⅶ. 무엇이 좋아지는가 (기대효과)</w:t>
+        <w:t>Ⅶ. 기대효과 및 정책적 의의</w:t>
         <w:br/>
         <w:br/>
         <w:t>부록</w:t>
@@ -345,7 +345,7 @@
           <w:color w:val="2E4A87"/>
           <w:sz w:val="26"/>
         </w:rPr>
-        <w:t>한눈에 보는 요약</w:t>
+        <w:t>요약문</w:t>
       </w:r>
     </w:p>
     <w:p>
@@ -366,7 +366,7 @@
           <w:b/>
           <w:sz w:val="20"/>
         </w:rPr>
-        <w:t>무엇을 하나?</w:t>
+        <w:t>사업 개요</w:t>
       </w:r>
       <w:r>
         <w:rPr>
@@ -411,7 +411,7 @@
           <w:rFonts w:ascii="맑은 고딕" w:hAnsi="맑은 고딕" w:eastAsia="맑은 고딕"/>
           <w:sz w:val="20"/>
         </w:rPr>
-        <w:t>만드는 6년(2027~2032) 사업입니다.</w:t>
+        <w:t>만드는 6년(2027~2032) 사업</w:t>
       </w:r>
     </w:p>
     <w:p>
@@ -432,7 +432,7 @@
           <w:b/>
           <w:sz w:val="20"/>
         </w:rPr>
-        <w:t>왜 하나?</w:t>
+        <w:t>추진 배경</w:t>
       </w:r>
       <w:r>
         <w:rPr>
@@ -451,7 +451,7 @@
           <w:rFonts w:ascii="맑은 고딕" w:hAnsi="맑은 고딕" w:eastAsia="맑은 고딕"/>
           <w:sz w:val="20"/>
         </w:rPr>
-        <w:t>○ 지금은 같은 한일 과거사인데도 자료가 6개 부처에 흩어져 있어 한 번에 찾아볼 수 없습니다.</w:t>
+        <w:t>○ 같은 한일 과거사인데도 자료가 6개 부처에 흩어져 있어 한 번에 찾아볼 수 없음</w:t>
       </w:r>
     </w:p>
     <w:p>
@@ -464,7 +464,7 @@
           <w:rFonts w:ascii="맑은 고딕" w:hAnsi="맑은 고딕" w:eastAsia="맑은 고딕"/>
           <w:sz w:val="20"/>
         </w:rPr>
-        <w:t>○ 일본은 이미 자기 입장의 디지털 자료관을 분야별로 만들어 운영하고 있습니다.</w:t>
+        <w:t>○ 일본은 이미 자기 입장의 디지털 자료관을 분야별로 만들어 운영 중</w:t>
       </w:r>
     </w:p>
     <w:p>
@@ -477,7 +477,7 @@
           <w:rFonts w:ascii="맑은 고딕" w:hAnsi="맑은 고딕" w:eastAsia="맑은 고딕"/>
           <w:sz w:val="20"/>
         </w:rPr>
-        <w:t>○ 피해자분들이 고령으로 돌아가시면서 증언·기록이 사라지고 있습니다.</w:t>
+        <w:t>○ 피해자 고령화로 증언·기록이 소멸 위기</w:t>
       </w:r>
     </w:p>
     <w:p>
@@ -490,7 +490,7 @@
           <w:rFonts w:ascii="맑은 고딕" w:hAnsi="맑은 고딕" w:eastAsia="맑은 고딕"/>
           <w:sz w:val="20"/>
         </w:rPr>
-        <w:t>○ AI 시대에 우리 자료가 없으면, AI가 일본 입장으로 역사를 설명할 수 있습니다.</w:t>
+        <w:t>○ AI 시대에 우리 자료가 없으면, AI가 일본 입장으로 역사를 설명할 우려</w:t>
       </w:r>
     </w:p>
     <w:p>
@@ -511,7 +511,7 @@
           <w:b/>
           <w:sz w:val="20"/>
         </w:rPr>
-        <w:t>어떻게 다른가?</w:t>
+        <w:t>차별성</w:t>
       </w:r>
       <w:r>
         <w:rPr>
@@ -543,7 +543,7 @@
           <w:rFonts w:ascii="맑은 고딕" w:hAnsi="맑은 고딕" w:eastAsia="맑은 고딕"/>
           <w:sz w:val="20"/>
         </w:rPr>
-        <w:t>'AI 통합 검색'을 제공합니다.</w:t>
+        <w:t>'AI 통합 검색' 제공</w:t>
       </w:r>
     </w:p>
     <w:p>
@@ -564,7 +564,7 @@
           <w:b/>
           <w:sz w:val="20"/>
         </w:rPr>
-        <w:t>누가 하나?</w:t>
+        <w:t>추진 체계</w:t>
       </w:r>
       <w:r>
         <w:rPr>
@@ -583,7 +583,7 @@
           <w:rFonts w:ascii="맑은 고딕" w:hAnsi="맑은 고딕" w:eastAsia="맑은 고딕"/>
           <w:sz w:val="20"/>
         </w:rPr>
-        <w:t>국무조정실이 총괄하고, 행정안전부(국가기록원)가 실무를 맡으며,</w:t>
+        <w:t>국무조정실 총괄, 행정안전부(국가기록원) 실무 수행,</w:t>
       </w:r>
     </w:p>
     <w:p>
@@ -596,7 +596,7 @@
           <w:rFonts w:ascii="맑은 고딕" w:hAnsi="맑은 고딕" w:eastAsia="맑은 고딕"/>
           <w:sz w:val="20"/>
         </w:rPr>
-        <w:t>교육부·외교부·국가보훈부·문체부·과기부가 분야별로 협력합니다.</w:t>
+        <w:t>교육부·외교부·국가보훈부·문체부·과기부 분야별 협력</w:t>
       </w:r>
     </w:p>
     <w:p>
@@ -617,7 +617,7 @@
           <w:b/>
           <w:sz w:val="20"/>
         </w:rPr>
-        <w:t>얼마인가?</w:t>
+        <w:t>사업 규모</w:t>
       </w:r>
       <w:r>
         <w:rPr>
@@ -636,7 +636,7 @@
           <w:rFonts w:ascii="맑은 고딕" w:hAnsi="맑은 고딕" w:eastAsia="맑은 고딕"/>
           <w:sz w:val="20"/>
         </w:rPr>
-        <w:t>6년간 총 48억 원(연 8억 원). 분야별 부처가 나누어 분담합니다.</w:t>
+        <w:t>6년간 총 48억 원(연 8억 원), 분야별 부처 분담</w:t>
       </w:r>
     </w:p>
     <w:p>
@@ -661,7 +661,7 @@
           <w:color w:val="2E4A87"/>
           <w:sz w:val="26"/>
         </w:rPr>
-        <w:t>Ⅰ. 왜 이 사업이 필요한가</w:t>
+        <w:t>Ⅰ. 사업 배경 및 필요성</w:t>
       </w:r>
     </w:p>
     <w:p>
@@ -675,7 +675,7 @@
           <w:color w:val="2E4A87"/>
           <w:sz w:val="22"/>
         </w:rPr>
-        <w:t>1. 한일 과거사 갈등은 따로따로가 아니라 하나로 얽혀 있다</w:t>
+        <w:t>1. 사안 횡단적 성격의 한일 과거사 갈등</w:t>
       </w:r>
     </w:p>
     <w:p>
@@ -1119,7 +1119,7 @@
           <w:color w:val="2E4A87"/>
           <w:sz w:val="22"/>
         </w:rPr>
-        <w:t>2. 자료가 6개 부처에 흩어져 한 번에 못 찾는다</w:t>
+        <w:t>2. 부처별로 분산된 자료와 통합 시스템 부재</w:t>
       </w:r>
     </w:p>
     <w:p>
@@ -1622,7 +1622,7 @@
           <w:color w:val="2E4A87"/>
           <w:sz w:val="22"/>
         </w:rPr>
-        <w:t>3. 일본의 '역사 부정'이 인터넷으로 퍼지고 있다</w:t>
+        <w:t>3. 역사부정론의 디지털 확산</w:t>
       </w:r>
     </w:p>
     <w:p>
@@ -1688,7 +1688,7 @@
           <w:color w:val="2E4A87"/>
           <w:sz w:val="22"/>
         </w:rPr>
-        <w:t>4. 피해자분들이 돌아가시며 기록이 사라지고 있다</w:t>
+        <w:t>4. 피해자 부재 시대의 기록 소멸 위기</w:t>
       </w:r>
     </w:p>
     <w:p>
@@ -1754,7 +1754,7 @@
           <w:color w:val="2E4A87"/>
           <w:sz w:val="22"/>
         </w:rPr>
-        <w:t>5. AI 시대, 우리 자료가 없으면 역사 해석을 빼앗긴다</w:t>
+        <w:t>5. AI 전환 시대의 데이터 주권과 사업 당위성</w:t>
       </w:r>
     </w:p>
     <w:p>
@@ -1857,7 +1857,7 @@
           <w:color w:val="2E4A87"/>
           <w:sz w:val="26"/>
         </w:rPr>
-        <w:t>Ⅱ. 무엇을 모으는가</w:t>
+        <w:t>Ⅱ. 아카이빙 대상 자료 현황 및 수집 계획</w:t>
       </w:r>
     </w:p>
     <w:p>
@@ -1871,7 +1871,7 @@
           <w:color w:val="2E4A87"/>
           <w:sz w:val="22"/>
         </w:rPr>
-        <w:t>1. 6대 분야별 자료와 우선순위</w:t>
+        <w:t>1. 6대 도메인별 자료 현황 및 우선순위</w:t>
       </w:r>
     </w:p>
     <w:tbl>
@@ -2391,7 +2391,7 @@
           <w:color w:val="2E4A87"/>
           <w:sz w:val="22"/>
         </w:rPr>
-        <w:t>2. 특히 급한 자료: 피해자의 목소리와 개인 기록</w:t>
+        <w:t>2. 우선 수집 대상: 구술·개인기록·소송기록</w:t>
       </w:r>
     </w:p>
     <w:p>
@@ -2522,7 +2522,7 @@
           <w:color w:val="2E4A87"/>
           <w:sz w:val="22"/>
         </w:rPr>
-        <w:t>3. 자료가 어디에 있고, 얼마나 볼 수 있나</w:t>
+        <w:t>3. 소장 기관별 현황 및 접근성</w:t>
       </w:r>
     </w:p>
     <w:tbl>
@@ -3053,7 +3053,7 @@
           <w:color w:val="2E4A87"/>
           <w:sz w:val="26"/>
         </w:rPr>
-        <w:t>Ⅲ. 어떻게 만드는가</w:t>
+        <w:t>Ⅲ. 기술 구현 방향 및 시스템 설계</w:t>
       </w:r>
     </w:p>
     <w:p>
@@ -3120,7 +3120,7 @@
           <w:color w:val="2E4A87"/>
           <w:sz w:val="22"/>
         </w:rPr>
-        <w:t>1. 오래된 자료를 디지털로 바꾸기</w:t>
+        <w:t>1. 자료 디지털화 방향</w:t>
       </w:r>
     </w:p>
     <w:p>
@@ -3293,7 +3293,7 @@
           <w:color w:val="2E4A87"/>
           <w:sz w:val="22"/>
         </w:rPr>
-        <w:t>2. 자료를 정리하고 서로 연결하기</w:t>
+        <w:t>2. 자료 정리 및 연결 체계</w:t>
       </w:r>
     </w:p>
     <w:p>
@@ -3439,7 +3439,7 @@
           <w:color w:val="2E4A87"/>
           <w:sz w:val="22"/>
         </w:rPr>
-        <w:t>3. AI가 찾아주고 연결해주기</w:t>
+        <w:t>3. AI 기반 검색·연결 기능</w:t>
       </w:r>
     </w:p>
     <w:p>
@@ -3585,7 +3585,7 @@
           <w:color w:val="2E4A87"/>
           <w:sz w:val="22"/>
         </w:rPr>
-        <w:t>4. 전체 모습과 자료 보관 원칙</w:t>
+        <w:t>4. 시스템 구성 및 자료 보관 원칙</w:t>
       </w:r>
     </w:p>
     <w:p>
@@ -3706,7 +3706,7 @@
           <w:color w:val="2E4A87"/>
           <w:sz w:val="26"/>
         </w:rPr>
-        <w:t>Ⅳ. 언제, 얼마로 하는가</w:t>
+        <w:t>Ⅳ. 추진 로드맵 및 예산 계획</w:t>
       </w:r>
     </w:p>
     <w:p>
@@ -3720,7 +3720,7 @@
           <w:color w:val="2E4A87"/>
           <w:sz w:val="22"/>
         </w:rPr>
-        <w:t>1. 6년 추진 계획 (2027~2032)</w:t>
+        <w:t>1. 단계별 추진 계획 (2027~2032)</w:t>
       </w:r>
     </w:p>
     <w:p>
@@ -3866,7 +3866,7 @@
           <w:color w:val="2E4A87"/>
           <w:sz w:val="22"/>
         </w:rPr>
-        <w:t>2. 해마다 얻는 성과 (목표치)</w:t>
+        <w:t>2. 연도별 핵심 성과 지표</w:t>
       </w:r>
     </w:p>
     <w:tbl>
@@ -4304,7 +4304,7 @@
           <w:color w:val="2E4A87"/>
           <w:sz w:val="22"/>
         </w:rPr>
-        <w:t>3. 예산: 6년간 총 48억 원 (연 8억 원)</w:t>
+        <w:t>3. 예산 계획: 총 48억 원 (연 8억 원)</w:t>
       </w:r>
     </w:p>
     <w:p>
@@ -5152,7 +5152,7 @@
           <w:color w:val="2E4A87"/>
           <w:sz w:val="22"/>
         </w:rPr>
-        <w:t>4. 사업이 끝난 뒤에도 계속</w:t>
+        <w:t>4. 사업 지속 운영 방안</w:t>
       </w:r>
     </w:p>
     <w:p>
@@ -5203,7 +5203,7 @@
           <w:color w:val="2E4A87"/>
           <w:sz w:val="26"/>
         </w:rPr>
-        <w:t>Ⅴ. 누가 추진하는가</w:t>
+        <w:t>Ⅴ. 사업 추진 체계 및 소관 부처·산하기관 분석</w:t>
       </w:r>
     </w:p>
     <w:p>
@@ -5217,7 +5217,7 @@
           <w:color w:val="2E4A87"/>
           <w:sz w:val="22"/>
         </w:rPr>
-        <w:t>1. 지금은 6개 부처에 흩어져 총괄하는 곳이 없다</w:t>
+        <w:t>1. 부처별 분산 추진의 문제점</w:t>
       </w:r>
     </w:p>
     <w:p>
@@ -5270,7 +5270,7 @@
           <w:color w:val="2E4A87"/>
           <w:sz w:val="22"/>
         </w:rPr>
-        <w:t>2. 그래서 '범정부 추진' + '행안부 실무'로 한다</w:t>
+        <w:t>2. 범정부 추진 + 행안부 실무 수행 체계</w:t>
       </w:r>
     </w:p>
     <w:p>
@@ -5606,7 +5606,7 @@
           <w:color w:val="2E4A87"/>
           <w:sz w:val="22"/>
         </w:rPr>
-        <w:t>3. 부처별 역할 나누기</w:t>
+        <w:t>3. 부처별 역할 분담</w:t>
       </w:r>
     </w:p>
     <w:tbl>
@@ -6050,7 +6050,7 @@
           <w:color w:val="2E4A87"/>
           <w:sz w:val="22"/>
         </w:rPr>
-        <w:t>5. 실무를 맡을 조직은 어디에?</w:t>
+        <w:t>5. 사업 수행기관(사무국) 설계</w:t>
       </w:r>
     </w:p>
     <w:p>
@@ -6142,7 +6142,7 @@
           <w:color w:val="2E4A87"/>
           <w:sz w:val="26"/>
         </w:rPr>
-        <w:t>Ⅵ. 누구와 협력하는가</w:t>
+        <w:t>Ⅵ. 협력 체계 구축 방안</w:t>
       </w:r>
     </w:p>
     <w:p>
@@ -7057,7 +7057,7 @@
           <w:color w:val="2E4A87"/>
           <w:sz w:val="26"/>
         </w:rPr>
-        <w:t>Ⅶ. 무엇이 좋아지는가</w:t>
+        <w:t>Ⅶ. 기대효과 및 정책적 의의</w:t>
       </w:r>
     </w:p>
     <w:p>
@@ -7078,7 +7078,7 @@
           <w:b/>
           <w:sz w:val="20"/>
         </w:rPr>
-        <w:t>흩어진 과거사 정책이 하나로 모입니다</w:t>
+        <w:t>과거사 정책의 통합 추진 기반 마련</w:t>
       </w:r>
       <w:r>
         <w:rPr>
@@ -7118,7 +7118,7 @@
           <w:b/>
           <w:sz w:val="20"/>
         </w:rPr>
-        <w:t>역사 왜곡에 증거로 대응할 수 있습니다</w:t>
+        <w:t>역사부정론 대응 실증 기반 확보</w:t>
       </w:r>
       <w:r>
         <w:rPr>
@@ -7171,7 +7171,7 @@
           <w:b/>
           <w:sz w:val="20"/>
         </w:rPr>
-        <w:t>잠자던 국가 자료가 살아납니다</w:t>
+        <w:t>사장된 국가 자료의 활용</w:t>
       </w:r>
       <w:r>
         <w:rPr>
@@ -7211,7 +7211,7 @@
           <w:b/>
           <w:sz w:val="20"/>
         </w:rPr>
-        <w:t>AI 시대 역사 해석의 주도권을 지킵니다</w:t>
+        <w:t>AI 시대 역사 해석 주도권 확보</w:t>
       </w:r>
       <w:r>
         <w:rPr>
@@ -7251,7 +7251,7 @@
           <w:b/>
           <w:sz w:val="20"/>
         </w:rPr>
-        <w:t>다음 세대 교육과 한일 시민 연대의 토대가 됩니다</w:t>
+        <w:t>차세대 교육 및 한일 시민 연대 기반 구축</w:t>
       </w:r>
       <w:r>
         <w:rPr>

</xml_diff>

<commit_message>
Revert body to 개조식 (noun-form) style; clarify '쉽게' means vocabulary not prose
- skill.md: 독자·난이도 원칙 재정의 — '쉽게'는 개조식 형식은 유지하고 용어·내용만 쉽게 한다는 뜻, 줄글·구어체(~합니다) 금지 명시. 편집팀장 원칙에도 개조식 유지 반영
- 기획서: 본문 전체를 구어체 줄글에서 개조식(명사형 종결·항목화)으로 환원. 쉬운 용어·괄호 풀이(OCR·소버린 AI 등)와 기술/예산 상세의 부록 배치는 그대로 유지
</commit_message>
<xml_diff>
--- a/기획서/강제동원_통합DB_아카이브넷_구축_기획서.docx
+++ b/기획서/강제동원_통합DB_아카이브넷_구축_기획서.docx
@@ -184,76 +184,25 @@
           <w:color w:val="2E4A87"/>
           <w:sz w:val="20"/>
         </w:rPr>
+        <w:t>※ 본 보고서는 비전문가 독자를 위해 전문용어에 쉬운 풀이를 괄호로 병기함</w:t>
       </w:r>
-      <w:r>
-        <w:rPr>
-          <w:rFonts w:ascii="맑은 고딕" w:hAnsi="맑은 고딕" w:eastAsia="맑은 고딕"/>
-          <w:b/>
-          <w:color w:val="2E4A87"/>
-          <w:sz w:val="20"/>
-        </w:rPr>
-        <w:t>이 보고서를 읽으시는 분께</w:t>
-      </w:r>
+    </w:p>
+    <w:p>
+      <w:pPr>
+        <w:ind w:left="283"/>
+        <w:spacing w:before="20" w:after="20" w:line="240" w:lineRule="auto"/>
+        <w:shd w:val="clear" w:color="auto" w:fill="F2F5FB"/>
+        <w:pBdr>
+          <w:left w:val="single" w:sz="18" w:space="8" w:color="2E4A87"/>
+        </w:pBdr>
+      </w:pPr>
       <w:r>
         <w:rPr>
           <w:rFonts w:ascii="맑은 고딕" w:hAnsi="맑은 고딕" w:eastAsia="맑은 고딕"/>
           <w:color w:val="2E4A87"/>
           <w:sz w:val="20"/>
         </w:rPr>
-      </w:r>
-    </w:p>
-    <w:p>
-      <w:pPr>
-        <w:ind w:left="283"/>
-        <w:spacing w:before="20" w:after="20" w:line="240" w:lineRule="auto"/>
-        <w:shd w:val="clear" w:color="auto" w:fill="F2F5FB"/>
-        <w:pBdr>
-          <w:left w:val="single" w:sz="18" w:space="8" w:color="2E4A87"/>
-        </w:pBdr>
-      </w:pPr>
-      <w:r>
-        <w:rPr>
-          <w:rFonts w:ascii="맑은 고딕" w:hAnsi="맑은 고딕" w:eastAsia="맑은 고딕"/>
-          <w:color w:val="2E4A87"/>
-          <w:sz w:val="20"/>
-        </w:rPr>
-        <w:t>본 보고서는 전문 지식 없이도 이해하실 수 있도록 쉬운 말로 작성하였습니다.</w:t>
-      </w:r>
-    </w:p>
-    <w:p>
-      <w:pPr>
-        <w:ind w:left="283"/>
-        <w:spacing w:before="20" w:after="20" w:line="240" w:lineRule="auto"/>
-        <w:shd w:val="clear" w:color="auto" w:fill="F2F5FB"/>
-        <w:pBdr>
-          <w:left w:val="single" w:sz="18" w:space="8" w:color="2E4A87"/>
-        </w:pBdr>
-      </w:pPr>
-      <w:r>
-        <w:rPr>
-          <w:rFonts w:ascii="맑은 고딕" w:hAnsi="맑은 고딕" w:eastAsia="맑은 고딕"/>
-          <w:color w:val="2E4A87"/>
-          <w:sz w:val="20"/>
-        </w:rPr>
-        <w:t>본문은 '무엇을, 왜 하는가'를 중심으로 핵심만 담았고,</w:t>
-      </w:r>
-    </w:p>
-    <w:p>
-      <w:pPr>
-        <w:ind w:left="283"/>
-        <w:spacing w:before="20" w:after="20" w:line="240" w:lineRule="auto"/>
-        <w:shd w:val="clear" w:color="auto" w:fill="F2F5FB"/>
-        <w:pBdr>
-          <w:left w:val="single" w:sz="18" w:space="8" w:color="2E4A87"/>
-        </w:pBdr>
-      </w:pPr>
-      <w:r>
-        <w:rPr>
-          <w:rFonts w:ascii="맑은 고딕" w:hAnsi="맑은 고딕" w:eastAsia="맑은 고딕"/>
-          <w:color w:val="2E4A87"/>
-          <w:sz w:val="20"/>
-        </w:rPr>
-        <w:t>기술 사양·예산 산출 등 상세 내용은 뒤쪽 부록에 따로 정리하였습니다.</w:t>
+        <w:t>※ 본문은 핵심 위주로 기술하고, 기술 사양·예산 산출 등 상세 내용은 부록에 수록</w:t>
       </w:r>
     </w:p>
     <w:p>
@@ -358,21 +307,20 @@
           <w:rFonts w:ascii="맑은 고딕" w:hAnsi="맑은 고딕" w:eastAsia="맑은 고딕"/>
           <w:sz w:val="20"/>
         </w:rPr>
-        <w:t xml:space="preserve">□ </w:t>
+        <w:t>□ 사업 개요</w:t>
       </w:r>
-      <w:r>
-        <w:rPr>
-          <w:rFonts w:ascii="맑은 고딕" w:hAnsi="맑은 고딕" w:eastAsia="맑은 고딕"/>
-          <w:b/>
-          <w:sz w:val="20"/>
-        </w:rPr>
-        <w:t>사업 개요</w:t>
-      </w:r>
+    </w:p>
+    <w:p>
+      <w:pPr>
+        <w:spacing w:before="0" w:after="3" w:line="240" w:lineRule="auto"/>
+        <w:ind w:left="283"/>
+      </w:pPr>
       <w:r>
         <w:rPr>
           <w:rFonts w:ascii="맑은 고딕" w:hAnsi="맑은 고딕" w:eastAsia="맑은 고딕"/>
           <w:sz w:val="20"/>
         </w:rPr>
+        <w:t>○ 한일 과거사(강제동원·일본군'위안부'·독도·역사교과서·식민피해·약탈문화재) 관련 기록을 통합 디지털 데이터베이스(DB)로 구축하고, 국내외 기관을 연결하는 「한일과거사 AI 아카이브넷」을 조성하는 6개년(2027~2032) 범정부 사업</w:t>
       </w:r>
     </w:p>
     <w:p>
@@ -385,73 +333,72 @@
           <w:rFonts w:ascii="맑은 고딕" w:hAnsi="맑은 고딕" w:eastAsia="맑은 고딕"/>
           <w:sz w:val="20"/>
         </w:rPr>
-        <w:t>한일 과거사(강제동원·일본군'위안부'·독도·역사교과서·식민피해·약탈문화재) 관련 기록을</w:t>
+        <w:t>□ 추진 배경</w:t>
       </w:r>
     </w:p>
     <w:p>
       <w:pPr>
         <w:spacing w:before="0" w:after="3" w:line="240" w:lineRule="auto"/>
-        <w:ind w:left="0"/>
+        <w:ind w:left="283"/>
       </w:pPr>
       <w:r>
         <w:rPr>
           <w:rFonts w:ascii="맑은 고딕" w:hAnsi="맑은 고딕" w:eastAsia="맑은 고딕"/>
           <w:sz w:val="20"/>
         </w:rPr>
-        <w:t>한곳에 모아 디지털로 정리하고, 국내외 기관을 연결하는 「한일과거사 AI 아카이브넷」을</w:t>
+        <w:t>○ 같은 한일 과거사임에도 자료가 6개 부처에 분산되어 통합 검색 불가</w:t>
       </w:r>
     </w:p>
     <w:p>
       <w:pPr>
         <w:spacing w:before="0" w:after="3" w:line="240" w:lineRule="auto"/>
-        <w:ind w:left="0"/>
+        <w:ind w:left="283"/>
       </w:pPr>
       <w:r>
         <w:rPr>
           <w:rFonts w:ascii="맑은 고딕" w:hAnsi="맑은 고딕" w:eastAsia="맑은 고딕"/>
           <w:sz w:val="20"/>
         </w:rPr>
-        <w:t>만드는 6년(2027~2032) 사업</w:t>
+        <w:t>○ 일본은 이미 자국 입장의 분야별 디지털 아카이브를 구축·운영 중</w:t>
       </w:r>
     </w:p>
     <w:p>
       <w:pPr>
         <w:spacing w:before="0" w:after="3" w:line="240" w:lineRule="auto"/>
-        <w:ind w:left="0"/>
+        <w:ind w:left="283"/>
       </w:pPr>
       <w:r>
         <w:rPr>
           <w:rFonts w:ascii="맑은 고딕" w:hAnsi="맑은 고딕" w:eastAsia="맑은 고딕"/>
           <w:sz w:val="20"/>
         </w:rPr>
-        <w:t xml:space="preserve">□ </w:t>
+        <w:t>○ 피해자 고령화로 증언·민간기록 소멸 위기</w:t>
       </w:r>
-      <w:r>
-        <w:rPr>
-          <w:rFonts w:ascii="맑은 고딕" w:hAnsi="맑은 고딕" w:eastAsia="맑은 고딕"/>
-          <w:b/>
-          <w:sz w:val="20"/>
-        </w:rPr>
-        <w:t>추진 배경</w:t>
-      </w:r>
+    </w:p>
+    <w:p>
+      <w:pPr>
+        <w:spacing w:before="0" w:after="3" w:line="240" w:lineRule="auto"/>
+        <w:ind w:left="283"/>
+      </w:pPr>
       <w:r>
         <w:rPr>
           <w:rFonts w:ascii="맑은 고딕" w:hAnsi="맑은 고딕" w:eastAsia="맑은 고딕"/>
           <w:sz w:val="20"/>
         </w:rPr>
+        <w:t>○ AI 학습 데이터 공백 시 AI가 일본 입장으로 역사 서술을 재생산할 우려</w:t>
       </w:r>
     </w:p>
     <w:p>
       <w:pPr>
         <w:spacing w:before="0" w:after="3" w:line="240" w:lineRule="auto"/>
-        <w:ind w:left="283"/>
+        <w:ind w:left="0"/>
       </w:pPr>
       <w:r>
         <w:rPr>
           <w:rFonts w:ascii="맑은 고딕" w:hAnsi="맑은 고딕" w:eastAsia="맑은 고딕"/>
           <w:sz w:val="20"/>
         </w:rPr>
-        <w:t>○ 같은 한일 과거사인데도 자료가 6개 부처에 흩어져 있어 한 번에 찾아볼 수 없음</w:t>
+        <w:t>□ 차별성</w:t>
       </w:r>
     </w:p>
     <w:p>
@@ -464,20 +411,20 @@
           <w:rFonts w:ascii="맑은 고딕" w:hAnsi="맑은 고딕" w:eastAsia="맑은 고딕"/>
           <w:sz w:val="20"/>
         </w:rPr>
-        <w:t>○ 일본은 이미 자기 입장의 디지털 자료관을 분야별로 만들어 운영 중</w:t>
+        <w:t>○ 분야 칸막이를 제거하고, 인물 중심으로 강제동원·원폭·소송 자료를 통합 검색하는 'AI 사안 횡단 검색' 제공</w:t>
       </w:r>
     </w:p>
     <w:p>
       <w:pPr>
         <w:spacing w:before="0" w:after="3" w:line="240" w:lineRule="auto"/>
-        <w:ind w:left="283"/>
+        <w:ind w:left="0"/>
       </w:pPr>
       <w:r>
         <w:rPr>
           <w:rFonts w:ascii="맑은 고딕" w:hAnsi="맑은 고딕" w:eastAsia="맑은 고딕"/>
           <w:sz w:val="20"/>
         </w:rPr>
-        <w:t>○ 피해자 고령화로 증언·기록이 소멸 위기</w:t>
+        <w:t>□ 추진 체계</w:t>
       </w:r>
     </w:p>
     <w:p>
@@ -490,7 +437,7 @@
           <w:rFonts w:ascii="맑은 고딕" w:hAnsi="맑은 고딕" w:eastAsia="맑은 고딕"/>
           <w:sz w:val="20"/>
         </w:rPr>
-        <w:t>○ AI 시대에 우리 자료가 없으면, AI가 일본 입장으로 역사를 설명할 우려</w:t>
+        <w:t>○ 국무조정실 총괄, 행정안전부(국가기록원) 실무 수행, 교육부·외교부·국가보훈부·문체부·과기부 분야별 협력</w:t>
       </w:r>
     </w:p>
     <w:p>
@@ -503,140 +450,20 @@
           <w:rFonts w:ascii="맑은 고딕" w:hAnsi="맑은 고딕" w:eastAsia="맑은 고딕"/>
           <w:sz w:val="20"/>
         </w:rPr>
-        <w:t xml:space="preserve">□ </w:t>
+        <w:t>□ 사업 규모</w:t>
       </w:r>
-      <w:r>
-        <w:rPr>
-          <w:rFonts w:ascii="맑은 고딕" w:hAnsi="맑은 고딕" w:eastAsia="맑은 고딕"/>
-          <w:b/>
-          <w:sz w:val="20"/>
-        </w:rPr>
-        <w:t>차별성</w:t>
-      </w:r>
+    </w:p>
+    <w:p>
+      <w:pPr>
+        <w:spacing w:before="0" w:after="3" w:line="240" w:lineRule="auto"/>
+        <w:ind w:left="283"/>
+      </w:pPr>
       <w:r>
         <w:rPr>
           <w:rFonts w:ascii="맑은 고딕" w:hAnsi="맑은 고딕" w:eastAsia="맑은 고딕"/>
           <w:sz w:val="20"/>
         </w:rPr>
-      </w:r>
-    </w:p>
-    <w:p>
-      <w:pPr>
-        <w:spacing w:before="0" w:after="3" w:line="240" w:lineRule="auto"/>
-        <w:ind w:left="0"/>
-      </w:pPr>
-      <w:r>
-        <w:rPr>
-          <w:rFonts w:ascii="맑은 고딕" w:hAnsi="맑은 고딕" w:eastAsia="맑은 고딕"/>
-          <w:sz w:val="20"/>
-        </w:rPr>
-        <w:t>분야 칸막이를 없애고, 사람 이름 하나로 강제동원·원폭·소송 자료를 한 번에 찾는</w:t>
-      </w:r>
-    </w:p>
-    <w:p>
-      <w:pPr>
-        <w:spacing w:before="0" w:after="3" w:line="240" w:lineRule="auto"/>
-        <w:ind w:left="0"/>
-      </w:pPr>
-      <w:r>
-        <w:rPr>
-          <w:rFonts w:ascii="맑은 고딕" w:hAnsi="맑은 고딕" w:eastAsia="맑은 고딕"/>
-          <w:sz w:val="20"/>
-        </w:rPr>
-        <w:t>'AI 통합 검색' 제공</w:t>
-      </w:r>
-    </w:p>
-    <w:p>
-      <w:pPr>
-        <w:spacing w:before="0" w:after="3" w:line="240" w:lineRule="auto"/>
-        <w:ind w:left="0"/>
-      </w:pPr>
-      <w:r>
-        <w:rPr>
-          <w:rFonts w:ascii="맑은 고딕" w:hAnsi="맑은 고딕" w:eastAsia="맑은 고딕"/>
-          <w:sz w:val="20"/>
-        </w:rPr>
-        <w:t xml:space="preserve">□ </w:t>
-      </w:r>
-      <w:r>
-        <w:rPr>
-          <w:rFonts w:ascii="맑은 고딕" w:hAnsi="맑은 고딕" w:eastAsia="맑은 고딕"/>
-          <w:b/>
-          <w:sz w:val="20"/>
-        </w:rPr>
-        <w:t>추진 체계</w:t>
-      </w:r>
-      <w:r>
-        <w:rPr>
-          <w:rFonts w:ascii="맑은 고딕" w:hAnsi="맑은 고딕" w:eastAsia="맑은 고딕"/>
-          <w:sz w:val="20"/>
-        </w:rPr>
-      </w:r>
-    </w:p>
-    <w:p>
-      <w:pPr>
-        <w:spacing w:before="0" w:after="3" w:line="240" w:lineRule="auto"/>
-        <w:ind w:left="0"/>
-      </w:pPr>
-      <w:r>
-        <w:rPr>
-          <w:rFonts w:ascii="맑은 고딕" w:hAnsi="맑은 고딕" w:eastAsia="맑은 고딕"/>
-          <w:sz w:val="20"/>
-        </w:rPr>
-        <w:t>국무조정실 총괄, 행정안전부(국가기록원) 실무 수행,</w:t>
-      </w:r>
-    </w:p>
-    <w:p>
-      <w:pPr>
-        <w:spacing w:before="0" w:after="3" w:line="240" w:lineRule="auto"/>
-        <w:ind w:left="0"/>
-      </w:pPr>
-      <w:r>
-        <w:rPr>
-          <w:rFonts w:ascii="맑은 고딕" w:hAnsi="맑은 고딕" w:eastAsia="맑은 고딕"/>
-          <w:sz w:val="20"/>
-        </w:rPr>
-        <w:t>교육부·외교부·국가보훈부·문체부·과기부 분야별 협력</w:t>
-      </w:r>
-    </w:p>
-    <w:p>
-      <w:pPr>
-        <w:spacing w:before="0" w:after="3" w:line="240" w:lineRule="auto"/>
-        <w:ind w:left="0"/>
-      </w:pPr>
-      <w:r>
-        <w:rPr>
-          <w:rFonts w:ascii="맑은 고딕" w:hAnsi="맑은 고딕" w:eastAsia="맑은 고딕"/>
-          <w:sz w:val="20"/>
-        </w:rPr>
-        <w:t xml:space="preserve">□ </w:t>
-      </w:r>
-      <w:r>
-        <w:rPr>
-          <w:rFonts w:ascii="맑은 고딕" w:hAnsi="맑은 고딕" w:eastAsia="맑은 고딕"/>
-          <w:b/>
-          <w:sz w:val="20"/>
-        </w:rPr>
-        <w:t>사업 규모</w:t>
-      </w:r>
-      <w:r>
-        <w:rPr>
-          <w:rFonts w:ascii="맑은 고딕" w:hAnsi="맑은 고딕" w:eastAsia="맑은 고딕"/>
-          <w:sz w:val="20"/>
-        </w:rPr>
-      </w:r>
-    </w:p>
-    <w:p>
-      <w:pPr>
-        <w:spacing w:before="0" w:after="3" w:line="240" w:lineRule="auto"/>
-        <w:ind w:left="0"/>
-      </w:pPr>
-      <w:r>
-        <w:rPr>
-          <w:rFonts w:ascii="맑은 고딕" w:hAnsi="맑은 고딕" w:eastAsia="맑은 고딕"/>
-          <w:sz w:val="20"/>
-        </w:rPr>
-        <w:t>6년간 총 48억 원(연 8억 원), 분야별 부처 분담</w:t>
+        <w:t>○ 6개년 총 48억 원(연 8억 원), 분야별 부처 분담</w:t>
       </w:r>
     </w:p>
     <w:p>
@@ -688,20 +515,20 @@
           <w:rFonts w:ascii="맑은 고딕" w:hAnsi="맑은 고딕" w:eastAsia="맑은 고딕"/>
           <w:sz w:val="20"/>
         </w:rPr>
-        <w:t>□ 강제동원·위안부·독도·교과서 문제는 별개가 아니라 '일본의 식민지배 책임 부정'이라는</w:t>
+        <w:t>□ 개별 현안이 아닌 구조적·상호 연결된 갈등</w:t>
       </w:r>
     </w:p>
     <w:p>
       <w:pPr>
         <w:spacing w:before="0" w:after="3" w:line="240" w:lineRule="auto"/>
-        <w:ind w:left="0"/>
+        <w:ind w:left="283"/>
       </w:pPr>
       <w:r>
         <w:rPr>
           <w:rFonts w:ascii="맑은 고딕" w:hAnsi="맑은 고딕" w:eastAsia="맑은 고딕"/>
           <w:sz w:val="20"/>
         </w:rPr>
-        <w:t>하나의 뿌리에서 나온 서로 연결된 문제입니다.</w:t>
+        <w:t>○ 강제동원·위안부·독도·교과서 문제는 '일본의 식민지배 책임 부정'이라는 하나의 뿌리에서 파생된 상호 연결 사안</w:t>
       </w:r>
     </w:p>
     <w:p>
@@ -714,7 +541,7 @@
           <w:rFonts w:ascii="맑은 고딕" w:hAnsi="맑은 고딕" w:eastAsia="맑은 고딕"/>
           <w:sz w:val="20"/>
         </w:rPr>
-        <w:t>○ 최근 주요 갈등 (분야가 서로 얽혀 있음)</w:t>
+        <w:t>○ 최근 주요 갈등 (분야 상호 연계)</w:t>
       </w:r>
     </w:p>
     <w:tbl>
@@ -1092,7 +919,7 @@
           <w:rFonts w:ascii="맑은 고딕" w:hAnsi="맑은 고딕" w:eastAsia="맑은 고딕"/>
           <w:sz w:val="20"/>
         </w:rPr>
-        <w:t>○ 일본은 하나의 논리로 여러 분야를 한꺼번에 공격하는데, 우리는 분야별·부처별로</w:t>
+        <w:t>○ 일본은 단일 논리로 다분야를 동시 공격하나, 한국은 분야별·부처별 분산 대응으로 역량 분산</w:t>
       </w:r>
     </w:p>
     <w:p>
@@ -1105,7 +932,33 @@
           <w:rFonts w:ascii="맑은 고딕" w:hAnsi="맑은 고딕" w:eastAsia="맑은 고딕"/>
           <w:sz w:val="20"/>
         </w:rPr>
-        <w:t>따로 대응하고 있어 힘이 분산됩니다.</w:t>
+        <w:t>□ 일본의 조직적 역사 왜곡 심화</w:t>
+      </w:r>
+    </w:p>
+    <w:p>
+      <w:pPr>
+        <w:spacing w:before="0" w:after="3" w:line="240" w:lineRule="auto"/>
+        <w:ind w:left="283"/>
+      </w:pPr>
+      <w:r>
+        <w:rPr>
+          <w:rFonts w:ascii="맑은 고딕" w:hAnsi="맑은 고딕" w:eastAsia="맑은 고딕"/>
+          <w:sz w:val="20"/>
+        </w:rPr>
+        <w:t>○ 교과서 검정기준 개정(2014)·각의결정(2021)으로 '강제연행'·'일본군위안부' 용어 삭제 유도, 공식 역사 서술에서 피해 사실 소거 전략 추진</w:t>
+      </w:r>
+    </w:p>
+    <w:p>
+      <w:pPr>
+        <w:spacing w:before="0" w:after="3" w:line="240" w:lineRule="auto"/>
+        <w:ind w:left="283"/>
+      </w:pPr>
+      <w:r>
+        <w:rPr>
+          <w:rFonts w:ascii="맑은 고딕" w:hAnsi="맑은 고딕" w:eastAsia="맑은 고딕"/>
+          <w:sz w:val="20"/>
+        </w:rPr>
+        <w:t>○ 군함도·위안부·독도 등 분야별 부정 전용 디지털 콘텐츠 운영으로 국제 여론전 전개</w:t>
       </w:r>
     </w:p>
     <w:p>
@@ -1132,7 +985,20 @@
           <w:rFonts w:ascii="맑은 고딕" w:hAnsi="맑은 고딕" w:eastAsia="맑은 고딕"/>
           <w:sz w:val="20"/>
         </w:rPr>
-        <w:t>□ 한일 과거사 자료가 분야마다 다른 부처·기관에 흩어져 있습니다.</w:t>
+        <w:t>□ 한일 과거사 자료의 6개 부처 분산</w:t>
+      </w:r>
+    </w:p>
+    <w:p>
+      <w:pPr>
+        <w:spacing w:before="0" w:after="3" w:line="240" w:lineRule="auto"/>
+        <w:ind w:left="283"/>
+      </w:pPr>
+      <w:r>
+        <w:rPr>
+          <w:rFonts w:ascii="맑은 고딕" w:hAnsi="맑은 고딕" w:eastAsia="맑은 고딕"/>
+          <w:sz w:val="20"/>
+        </w:rPr>
+        <w:t>○ 분야마다 다른 부처·기관에 자료가 분산 보관되어 통합 접근 불가</w:t>
       </w:r>
     </w:p>
     <w:tbl>
@@ -1569,46 +1435,20 @@
           <w:rFonts w:ascii="맑은 고딕" w:hAnsi="맑은 고딕" w:eastAsia="맑은 고딕"/>
           <w:sz w:val="20"/>
         </w:rPr>
-        <w:t>○ 독도·위안부는 분야별 자료관이 일부 있지만 서로 연결되어 있지 않고, 강제동원 등은</w:t>
+        <w:t>○ 독도·위안부는 분야별 아카이브가 일부 존재하나 상호 연계 전무, 강제동원 등은 통합 아카이브 자체가 부재</w:t>
       </w:r>
     </w:p>
     <w:p>
       <w:pPr>
         <w:spacing w:before="0" w:after="3" w:line="240" w:lineRule="auto"/>
-        <w:ind w:left="0"/>
+        <w:ind w:left="283"/>
       </w:pPr>
       <w:r>
         <w:rPr>
           <w:rFonts w:ascii="맑은 고딕" w:hAnsi="맑은 고딕" w:eastAsia="맑은 고딕"/>
           <w:sz w:val="20"/>
         </w:rPr>
-        <w:t>통합 자료관 자체가 없습니다.</w:t>
-      </w:r>
-    </w:p>
-    <w:p>
-      <w:pPr>
-        <w:spacing w:before="0" w:after="3" w:line="240" w:lineRule="auto"/>
-        <w:ind w:left="283"/>
-      </w:pPr>
-      <w:r>
-        <w:rPr>
-          <w:rFonts w:ascii="맑은 고딕" w:hAnsi="맑은 고딕" w:eastAsia="맑은 고딕"/>
-          <w:sz w:val="20"/>
-        </w:rPr>
-        <w:t>○ 특히 행정안전부가 가진 강제동원 피해자 판정자료 22만 건은 활용할 법적 근거가</w:t>
-      </w:r>
-    </w:p>
-    <w:p>
-      <w:pPr>
-        <w:spacing w:before="0" w:after="3" w:line="240" w:lineRule="auto"/>
-        <w:ind w:left="0"/>
-      </w:pPr>
-      <w:r>
-        <w:rPr>
-          <w:rFonts w:ascii="맑은 고딕" w:hAnsi="맑은 고딕" w:eastAsia="맑은 고딕"/>
-          <w:sz w:val="20"/>
-        </w:rPr>
-        <w:t>부족해 사실상 잠자고 있습니다.</w:t>
+        <w:t>○ 행안부 보유 강제동원 판정자료 22만 건은 활용 근거 미비로 사실상 비공개(사장) 상태</w:t>
       </w:r>
     </w:p>
     <w:p>
@@ -1635,20 +1475,20 @@
           <w:rFonts w:ascii="맑은 고딕" w:hAnsi="맑은 고딕" w:eastAsia="맑은 고딕"/>
           <w:sz w:val="20"/>
         </w:rPr>
-        <w:t>□ 일본 정부와 우익 단체는 강제동원·위안부·독도 각 분야마다 부정 전용 웹사이트·홍보자료를</w:t>
+        <w:t>□ 일본 정부·우익의 조직적 디지털 여론전</w:t>
       </w:r>
     </w:p>
     <w:p>
       <w:pPr>
         <w:spacing w:before="0" w:after="3" w:line="240" w:lineRule="auto"/>
-        <w:ind w:left="0"/>
+        <w:ind w:left="283"/>
       </w:pPr>
       <w:r>
         <w:rPr>
           <w:rFonts w:ascii="맑은 고딕" w:hAnsi="맑은 고딕" w:eastAsia="맑은 고딕"/>
           <w:sz w:val="20"/>
         </w:rPr>
-        <w:t>만들어 국제 사회에 자기 주장을 퍼뜨리고 있습니다.</w:t>
+        <w:t>○ 강제동원·위안부·독도 분야별 부정 전용 웹사이트·홍보자료 운영으로 국제 사회에 자국 주장 확산</w:t>
       </w:r>
     </w:p>
     <w:p>
@@ -1661,7 +1501,7 @@
           <w:rFonts w:ascii="맑은 고딕" w:hAnsi="맑은 고딕" w:eastAsia="맑은 고딕"/>
           <w:sz w:val="20"/>
         </w:rPr>
-        <w:t>○ 우리가 반박하려면 피해자 증언·원본 문서·재판 기록 같은 '증거 자료'가 한곳에 모여</w:t>
+        <w:t>○ 대응을 위해서는 피해자 증언·원본 문서·재판 기록 등 실증 자료의 통합 공개가 필요하나, 현재 분산으로 대응 미흡</w:t>
       </w:r>
     </w:p>
     <w:p>
@@ -1674,7 +1514,20 @@
           <w:rFonts w:ascii="맑은 고딕" w:hAnsi="맑은 고딕" w:eastAsia="맑은 고딕"/>
           <w:sz w:val="20"/>
         </w:rPr>
-        <w:t>누구나 볼 수 있어야 하는데, 지금은 흩어져 있어 제대로 대응하지 못합니다.</w:t>
+        <w:t>□ 생성형 AI 리스크</w:t>
+      </w:r>
+    </w:p>
+    <w:p>
+      <w:pPr>
+        <w:spacing w:before="0" w:after="3" w:line="240" w:lineRule="auto"/>
+        <w:ind w:left="283"/>
+      </w:pPr>
+      <w:r>
+        <w:rPr>
+          <w:rFonts w:ascii="맑은 고딕" w:hAnsi="맑은 고딕" w:eastAsia="맑은 고딕"/>
+          <w:sz w:val="20"/>
+        </w:rPr>
+        <w:t>○ AI 학습 데이터에서 한국 측 과거사 서사 공백 시 AI가 일본 입장으로 역사 서술을 재생산할 우려</w:t>
       </w:r>
     </w:p>
     <w:p>
@@ -1701,46 +1554,59 @@
           <w:rFonts w:ascii="맑은 고딕" w:hAnsi="맑은 고딕" w:eastAsia="맑은 고딕"/>
           <w:sz w:val="20"/>
         </w:rPr>
-        <w:t>□ 생존 피해자가 고령으로 급감하면서, 이제는 '증언'이 아니라 '기록'으로 역사를 이어가야</w:t>
+        <w:t>□ 증언에서 기록 중심 전승으로 전환 시급</w:t>
       </w:r>
     </w:p>
     <w:p>
       <w:pPr>
         <w:spacing w:before="0" w:after="3" w:line="240" w:lineRule="auto"/>
-        <w:ind w:left="0"/>
+        <w:ind w:left="283"/>
       </w:pPr>
       <w:r>
         <w:rPr>
           <w:rFonts w:ascii="맑은 고딕" w:hAnsi="맑은 고딕" w:eastAsia="맑은 고딕"/>
           <w:sz w:val="20"/>
         </w:rPr>
-        <w:t>하는 시대가 되었습니다.</w:t>
+        <w:t>○ 생존 피해자 고령화로 급감 → '증언'에서 '기록' 중심 전승 체계로 전환 불가피</w:t>
       </w:r>
     </w:p>
     <w:p>
       <w:pPr>
         <w:spacing w:before="0" w:after="3" w:line="240" w:lineRule="auto"/>
-        <w:ind w:left="283"/>
+        <w:ind w:left="0"/>
       </w:pPr>
       <w:r>
         <w:rPr>
           <w:rFonts w:ascii="맑은 고딕" w:hAnsi="맑은 고딕" w:eastAsia="맑은 고딕"/>
           <w:sz w:val="20"/>
         </w:rPr>
-        <w:t>○ 시민단체가 수십 년간 모은 구술 녹음·일기·편지 등은 단체 해산·고령화로 버려지거나</w:t>
+        <w:t>□ 민간 소장 기록의 멸실 위기</w:t>
       </w:r>
     </w:p>
     <w:p>
       <w:pPr>
         <w:spacing w:before="0" w:after="3" w:line="240" w:lineRule="auto"/>
-        <w:ind w:left="0"/>
+        <w:ind w:left="283"/>
       </w:pPr>
       <w:r>
         <w:rPr>
           <w:rFonts w:ascii="맑은 고딕" w:hAnsi="맑은 고딕" w:eastAsia="맑은 고딕"/>
           <w:sz w:val="20"/>
         </w:rPr>
-        <w:t>사라질 위험에 처해 있습니다. 한 번 없어지면 되살릴 수 없습니다.</w:t>
+        <w:t>○ 시민단체가 수십 년간 축적한 구술 녹음·일기·편지 등이 단체 해산·고령화로 폐기·유실 위험</w:t>
+      </w:r>
+    </w:p>
+    <w:p>
+      <w:pPr>
+        <w:spacing w:before="0" w:after="3" w:line="240" w:lineRule="auto"/>
+        <w:ind w:left="283"/>
+      </w:pPr>
+      <w:r>
+        <w:rPr>
+          <w:rFonts w:ascii="맑은 고딕" w:hAnsi="맑은 고딕" w:eastAsia="맑은 고딕"/>
+          <w:sz w:val="20"/>
+        </w:rPr>
+        <w:t>○ 한 번 소멸 시 복원 불가 → 국가 차원의 긴급 수집·보존 필요</w:t>
       </w:r>
     </w:p>
     <w:p>
@@ -1767,20 +1633,20 @@
           <w:rFonts w:ascii="맑은 고딕" w:hAnsi="맑은 고딕" w:eastAsia="맑은 고딕"/>
           <w:sz w:val="20"/>
         </w:rPr>
-        <w:t>□ 요즘 AI는 인터넷에 있는 글을 학습해 답을 만듭니다. 한국 측 과거사 자료가 부족하면,</w:t>
+        <w:t>□ 소버린 AI 시대의 역사 데이터 주권</w:t>
       </w:r>
     </w:p>
     <w:p>
       <w:pPr>
         <w:spacing w:before="0" w:after="3" w:line="240" w:lineRule="auto"/>
-        <w:ind w:left="0"/>
+        <w:ind w:left="283"/>
       </w:pPr>
       <w:r>
         <w:rPr>
           <w:rFonts w:ascii="맑은 고딕" w:hAnsi="맑은 고딕" w:eastAsia="맑은 고딕"/>
           <w:sz w:val="20"/>
         </w:rPr>
-        <w:t>AI가 일본 입장으로 역사를 설명하게 될 수 있습니다.</w:t>
+        <w:t>○ AI는 인터넷 텍스트를 학습해 답변을 생성 → 한국 측 자료 부족 시 AI가 일본 입장으로 역사 설명 우려</w:t>
       </w:r>
     </w:p>
     <w:p>
@@ -1793,7 +1659,7 @@
           <w:rFonts w:ascii="맑은 고딕" w:hAnsi="맑은 고딕" w:eastAsia="맑은 고딕"/>
           <w:sz w:val="20"/>
         </w:rPr>
-        <w:t>○ 그래서 우리 피해자 중심의 자료를 디지털로 잘 정리해 'AI가 배우는 자료'로 제공하는 것이</w:t>
+        <w:t>○ 피해자 중심 자료를 'AI 학습 데이터'로 제공하는 것이 '소버린 AI(자국 데이터로 만든 우리만의 AI)' 시대의 과제</w:t>
       </w:r>
     </w:p>
     <w:p>
@@ -1806,7 +1672,7 @@
           <w:rFonts w:ascii="맑은 고딕" w:hAnsi="맑은 고딕" w:eastAsia="맑은 고딕"/>
           <w:sz w:val="20"/>
         </w:rPr>
-        <w:t>중요합니다. 이것이 '소버린 AI(자국 데이터로 만든 우리만의 AI)' 시대의 과제입니다.</w:t>
+        <w:t>□ 해외 선제 대응 사례</w:t>
       </w:r>
     </w:p>
     <w:p>
@@ -1819,20 +1685,20 @@
           <w:rFonts w:ascii="맑은 고딕" w:hAnsi="맑은 고딕" w:eastAsia="맑은 고딕"/>
           <w:sz w:val="20"/>
         </w:rPr>
-        <w:t>○ 독일은 이미 26개국 강제노동 피해자 자료관을 만들었고, 일본도 자기 입장의 자료관을</w:t>
+        <w:t>○ 독일: 26개국 강제노동 피해자 구술아카이브 구축 / 일본: 자국 입장 아카이브(JACAR 등) 선제 완성</w:t>
       </w:r>
     </w:p>
     <w:p>
       <w:pPr>
         <w:spacing w:before="0" w:after="3" w:line="240" w:lineRule="auto"/>
-        <w:ind w:left="0"/>
+        <w:ind w:left="283"/>
       </w:pPr>
       <w:r>
         <w:rPr>
           <w:rFonts w:ascii="맑은 고딕" w:hAnsi="맑은 고딕" w:eastAsia="맑은 고딕"/>
           <w:sz w:val="20"/>
         </w:rPr>
-        <w:t>먼저 만들어 두었습니다. 우리도 더는 미룰 수 없습니다.</w:t>
+        <w:t>○ 한국도 대응 지체 불가 → 사안 통합형 아카이브로 격차 역전 필요</w:t>
       </w:r>
     </w:p>
     <w:p>
@@ -1946,7 +1812,7 @@
                 <w:color w:val="FFFFFF"/>
                 <w:sz w:val="18"/>
               </w:rPr>
-              <w:t>사라질 위험</w:t>
+              <w:t>소멸 위험</w:t>
             </w:r>
           </w:p>
         </w:tc>
@@ -2308,76 +2174,20 @@
           <w:rFonts w:ascii="맑은 고딕" w:hAnsi="맑은 고딕" w:eastAsia="맑은 고딕"/>
           <w:sz w:val="20"/>
         </w:rPr>
-        <w:t xml:space="preserve">○ </w:t>
+        <w:t>○ 소멸 위험이 큰 구술·개인기록(강제동원·위안부·식민피해)을 1단계 우선 수집</w:t>
       </w:r>
-      <w:r>
-        <w:rPr>
-          <w:rFonts w:ascii="맑은 고딕" w:hAnsi="맑은 고딕" w:eastAsia="맑은 고딕"/>
-          <w:b/>
-          <w:sz w:val="20"/>
-        </w:rPr>
-        <w:t>먼저 할 일</w:t>
-      </w:r>
+    </w:p>
+    <w:p>
+      <w:pPr>
+        <w:spacing w:before="0" w:after="3" w:line="240" w:lineRule="auto"/>
+        <w:ind w:left="283"/>
+      </w:pPr>
       <w:r>
         <w:rPr>
           <w:rFonts w:ascii="맑은 고딕" w:hAnsi="맑은 고딕" w:eastAsia="맑은 고딕"/>
           <w:sz w:val="20"/>
         </w:rPr>
-        <w:t>: 사라질 위험이 큰 구술 녹음·개인 기록(강제동원·위안부·식민피해)부터</w:t>
-      </w:r>
-    </w:p>
-    <w:p>
-      <w:pPr>
-        <w:spacing w:before="0" w:after="3" w:line="240" w:lineRule="auto"/>
-        <w:ind w:left="0"/>
-      </w:pPr>
-      <w:r>
-        <w:rPr>
-          <w:rFonts w:ascii="맑은 고딕" w:hAnsi="맑은 고딕" w:eastAsia="맑은 고딕"/>
-          <w:sz w:val="20"/>
-        </w:rPr>
-        <w:t>급히 모읍니다.</w:t>
-      </w:r>
-    </w:p>
-    <w:p>
-      <w:pPr>
-        <w:spacing w:before="0" w:after="3" w:line="240" w:lineRule="auto"/>
-        <w:ind w:left="283"/>
-      </w:pPr>
-      <w:r>
-        <w:rPr>
-          <w:rFonts w:ascii="맑은 고딕" w:hAnsi="맑은 고딕" w:eastAsia="맑은 고딕"/>
-          <w:sz w:val="20"/>
-        </w:rPr>
-        <w:t xml:space="preserve">○ </w:t>
-      </w:r>
-      <w:r>
-        <w:rPr>
-          <w:rFonts w:ascii="맑은 고딕" w:hAnsi="맑은 고딕" w:eastAsia="맑은 고딕"/>
-          <w:b/>
-          <w:sz w:val="20"/>
-        </w:rPr>
-        <w:t>나중에 연계</w:t>
-      </w:r>
-      <w:r>
-        <w:rPr>
-          <w:rFonts w:ascii="맑은 고딕" w:hAnsi="맑은 고딕" w:eastAsia="맑은 고딕"/>
-          <w:sz w:val="20"/>
-        </w:rPr>
-        <w:t>: 보존 상태가 좋은 독도·교과서·문화재 자료는 이미 있는 자료관과</w:t>
-      </w:r>
-    </w:p>
-    <w:p>
-      <w:pPr>
-        <w:spacing w:before="0" w:after="3" w:line="240" w:lineRule="auto"/>
-        <w:ind w:left="0"/>
-      </w:pPr>
-      <w:r>
-        <w:rPr>
-          <w:rFonts w:ascii="맑은 고딕" w:hAnsi="맑은 고딕" w:eastAsia="맑은 고딕"/>
-          <w:sz w:val="20"/>
-        </w:rPr>
-        <w:t>연결하는 방식으로 진행합니다.</w:t>
+        <w:t>○ 보존 양호한 독도·교과서·문화재는 기존 아카이브 연계 중심으로 추진</w:t>
       </w:r>
     </w:p>
     <w:p>
@@ -2404,7 +2214,7 @@
           <w:rFonts w:ascii="맑은 고딕" w:hAnsi="맑은 고딕" w:eastAsia="맑은 고딕"/>
           <w:sz w:val="20"/>
         </w:rPr>
-        <w:t>□ 구술 녹음 (피해자가 직접 말한 증언)</w:t>
+        <w:t>□ 구술 녹음 (피해자 직접 증언)</w:t>
       </w:r>
     </w:p>
     <w:p>
@@ -2417,20 +2227,20 @@
           <w:rFonts w:ascii="맑은 고딕" w:hAnsi="맑은 고딕" w:eastAsia="맑은 고딕"/>
           <w:sz w:val="20"/>
         </w:rPr>
-        <w:t>○ 강제동원·위안부·원폭 피해자 증언 녹음·영상. 오래된 카세트테이프·비디오테이프가 많아</w:t>
+        <w:t>○ 강제동원·위안부·원폭 피해자 증언 녹음·영상</w:t>
       </w:r>
     </w:p>
     <w:p>
       <w:pPr>
         <w:spacing w:before="0" w:after="3" w:line="240" w:lineRule="auto"/>
-        <w:ind w:left="0"/>
+        <w:ind w:left="283"/>
       </w:pPr>
       <w:r>
         <w:rPr>
           <w:rFonts w:ascii="맑은 고딕" w:hAnsi="맑은 고딕" w:eastAsia="맑은 고딕"/>
           <w:sz w:val="20"/>
         </w:rPr>
-        <w:t>지금 처리하지 않으면 못 듣게 됩니다.</w:t>
+        <w:t>○ 노후 카세트·비디오테이프 다수로 긴급 처리 필요</w:t>
       </w:r>
     </w:p>
     <w:p>
@@ -2443,7 +2253,7 @@
           <w:rFonts w:ascii="맑은 고딕" w:hAnsi="맑은 고딕" w:eastAsia="맑은 고딕"/>
           <w:sz w:val="20"/>
         </w:rPr>
-        <w:t>□ 개인 기록 (일기·편지·수첩)</w:t>
+        <w:t>□ 개인 기록 (일기·편지·수첩, '에고 기록물')</w:t>
       </w:r>
     </w:p>
     <w:p>
@@ -2456,20 +2266,7 @@
           <w:rFonts w:ascii="맑은 고딕" w:hAnsi="맑은 고딕" w:eastAsia="맑은 고딕"/>
           <w:sz w:val="20"/>
         </w:rPr>
-        <w:t>○ 사라질 위험이 가장 큰 자료입니다. 피해자·활동가가 돌아가시거나 단체가 해산하면 바로</w:t>
-      </w:r>
-    </w:p>
-    <w:p>
-      <w:pPr>
-        <w:spacing w:before="0" w:after="3" w:line="240" w:lineRule="auto"/>
-        <w:ind w:left="0"/>
-      </w:pPr>
-      <w:r>
-        <w:rPr>
-          <w:rFonts w:ascii="맑은 고딕" w:hAnsi="맑은 고딕" w:eastAsia="맑은 고딕"/>
-          <w:sz w:val="20"/>
-        </w:rPr>
-        <w:t>버려집니다.</w:t>
+        <w:t>○ 소멸 위험 최고 등급 — 생산자 사망·단체 해산 시 즉시 폐기 위험</w:t>
       </w:r>
     </w:p>
     <w:p>
@@ -2495,20 +2292,7 @@
           <w:rFonts w:ascii="맑은 고딕" w:hAnsi="맑은 고딕" w:eastAsia="맑은 고딕"/>
           <w:sz w:val="20"/>
         </w:rPr>
-        <w:t>○ 강제동원·위안부 피해자가 한국·일본 법원에 낸 재판 자료. 피해 사실을 법적으로 입증하는</w:t>
-      </w:r>
-    </w:p>
-    <w:p>
-      <w:pPr>
-        <w:spacing w:before="0" w:after="3" w:line="240" w:lineRule="auto"/>
-        <w:ind w:left="0"/>
-      </w:pPr>
-      <w:r>
-        <w:rPr>
-          <w:rFonts w:ascii="맑은 고딕" w:hAnsi="맑은 고딕" w:eastAsia="맑은 고딕"/>
-          <w:sz w:val="20"/>
-        </w:rPr>
-        <w:t>핵심 증거입니다. (강제동원만 약 15만 쪽)</w:t>
+        <w:t>○ 강제동원·위안부 피해자의 한일 법원 재판 자료, 피해 사실 법적 입증의 핵심 증거 (강제동원만 약 15만 쪽)</w:t>
       </w:r>
     </w:p>
     <w:p>
@@ -3015,20 +2799,34 @@
           <w:rFonts w:ascii="맑은 고딕" w:hAnsi="맑은 고딕" w:eastAsia="맑은 고딕"/>
           <w:sz w:val="20"/>
         </w:rPr>
-        <w:t>○ 가장 중요한 강제동원 판정자료 22만 건은 법을 정비해야 공개·활용할 수 있습니다.</w:t>
+        <w:t>○ 최대 자료인 강제동원 판정자료 22만 건은 법령 정비 후 공개·활용 가능</w:t>
       </w:r>
     </w:p>
     <w:p>
       <w:pPr>
         <w:spacing w:before="0" w:after="3" w:line="240" w:lineRule="auto"/>
-        <w:ind w:left="0"/>
+        <w:ind w:left="283"/>
       </w:pPr>
       <w:r>
         <w:rPr>
           <w:rFonts w:ascii="맑은 고딕" w:hAnsi="맑은 고딕" w:eastAsia="맑은 고딕"/>
           <w:sz w:val="20"/>
         </w:rPr>
-        <w:t>(자료 접근성 5단계 등급, 해외 소재 자료 목록 → 부록 5)</w:t>
+        <w:t xml:space="preserve">○ 자료 접근성 5단계 등급, 해외 소재 자료 → </w:t>
+      </w:r>
+      <w:r>
+        <w:rPr>
+          <w:rFonts w:ascii="맑은 고딕" w:hAnsi="맑은 고딕" w:eastAsia="맑은 고딕"/>
+          <w:b/>
+          <w:sz w:val="20"/>
+        </w:rPr>
+        <w:t>부록 5</w:t>
+      </w:r>
+      <w:r>
+        <w:rPr>
+          <w:rFonts w:ascii="맑은 고딕" w:hAnsi="맑은 고딕" w:eastAsia="맑은 고딕"/>
+          <w:sz w:val="20"/>
+        </w:rPr>
       </w:r>
     </w:p>
     <w:p>
@@ -3071,25 +2869,7 @@
           <w:color w:val="2E4A87"/>
           <w:sz w:val="20"/>
         </w:rPr>
-        <w:t>이 장은 '무엇을, 왜'를 중심으로 쉽게 설명합니다.</w:t>
-      </w:r>
-    </w:p>
-    <w:p>
-      <w:pPr>
-        <w:ind w:left="283"/>
-        <w:spacing w:before="20" w:after="20" w:line="240" w:lineRule="auto"/>
-        <w:shd w:val="clear" w:color="auto" w:fill="F2F5FB"/>
-        <w:pBdr>
-          <w:left w:val="single" w:sz="18" w:space="8" w:color="2E4A87"/>
-        </w:pBdr>
-      </w:pPr>
-      <w:r>
-        <w:rPr>
-          <w:rFonts w:ascii="맑은 고딕" w:hAnsi="맑은 고딕" w:eastAsia="맑은 고딕"/>
-          <w:color w:val="2E4A87"/>
-          <w:sz w:val="20"/>
-        </w:rPr>
-        <w:t xml:space="preserve">구체적인 기술 사양(해상도·표준 규격 등)은 </w:t>
+        <w:t xml:space="preserve">본 장은 '무엇을·왜' 중심으로 기술하며, 구체적 기술 사양(해상도·표준 규격 등)은 </w:t>
       </w:r>
       <w:r>
         <w:rPr>
@@ -3106,7 +2886,7 @@
           <w:color w:val="2E4A87"/>
           <w:sz w:val="20"/>
         </w:rPr>
-        <w:t>에 따로 담았습니다.</w:t>
+        <w:t>에 수록</w:t>
       </w:r>
     </w:p>
     <w:p>
@@ -3133,74 +2913,72 @@
           <w:rFonts w:ascii="맑은 고딕" w:hAnsi="맑은 고딕" w:eastAsia="맑은 고딕"/>
           <w:sz w:val="20"/>
         </w:rPr>
-        <w:t xml:space="preserve">□ </w:t>
+        <w:t>□ 노후 녹음·영상 매체 우선 보존 (최우선 긴급)</w:t>
       </w:r>
-      <w:r>
-        <w:rPr>
-          <w:rFonts w:ascii="맑은 고딕" w:hAnsi="맑은 고딕" w:eastAsia="맑은 고딕"/>
-          <w:b/>
-          <w:sz w:val="20"/>
-        </w:rPr>
-        <w:t>오래된 녹음·영상부터 살립니다 (가장 급함)</w:t>
-      </w:r>
+    </w:p>
+    <w:p>
+      <w:pPr>
+        <w:spacing w:before="0" w:after="3" w:line="240" w:lineRule="auto"/>
+        <w:ind w:left="283"/>
+      </w:pPr>
       <w:r>
         <w:rPr>
           <w:rFonts w:ascii="맑은 고딕" w:hAnsi="맑은 고딕" w:eastAsia="맑은 고딕"/>
           <w:sz w:val="20"/>
         </w:rPr>
+        <w:t>○ 카세트테이프·비디오테이프는 시간 경과 시 재생 불가 → 디지털화 전 복원·보존 처리 선행</w:t>
       </w:r>
     </w:p>
     <w:p>
       <w:pPr>
         <w:spacing w:before="0" w:after="3" w:line="240" w:lineRule="auto"/>
-        <w:ind w:left="283"/>
+        <w:ind w:left="0"/>
       </w:pPr>
       <w:r>
         <w:rPr>
           <w:rFonts w:ascii="맑은 고딕" w:hAnsi="맑은 고딕" w:eastAsia="맑은 고딕"/>
           <w:sz w:val="20"/>
         </w:rPr>
-        <w:t>○ 카세트테이프·비디오테이프는 시간이 지나면 못 쓰게 되므로, 디지털로 바꾸기 전에 먼저</w:t>
+        <w:t>□ 문서 자료: 스캔 후 글자 변환</w:t>
       </w:r>
     </w:p>
     <w:p>
       <w:pPr>
         <w:spacing w:before="0" w:after="3" w:line="240" w:lineRule="auto"/>
-        <w:ind w:left="0"/>
+        <w:ind w:left="283"/>
       </w:pPr>
       <w:r>
         <w:rPr>
           <w:rFonts w:ascii="맑은 고딕" w:hAnsi="맑은 고딕" w:eastAsia="맑은 고딕"/>
           <w:sz w:val="20"/>
         </w:rPr>
-        <w:t>복원·보존 처리를 합니다.</w:t>
+        <w:t>○ 'OCR(스캔한 사진을 컴퓨터가 읽는 글자로 바꾸는 기술)' 적용</w:t>
       </w:r>
     </w:p>
     <w:p>
       <w:pPr>
         <w:spacing w:before="0" w:after="3" w:line="240" w:lineRule="auto"/>
-        <w:ind w:left="0"/>
+        <w:ind w:left="283"/>
       </w:pPr>
       <w:r>
         <w:rPr>
           <w:rFonts w:ascii="맑은 고딕" w:hAnsi="맑은 고딕" w:eastAsia="맑은 고딕"/>
           <w:sz w:val="20"/>
         </w:rPr>
-        <w:t xml:space="preserve">□ </w:t>
+        <w:t>○ 일본어 옛 글씨·손글씨는 일반 기술로 처리 불가 → 전용 기술 별도 개발</w:t>
       </w:r>
-      <w:r>
-        <w:rPr>
-          <w:rFonts w:ascii="맑은 고딕" w:hAnsi="맑은 고딕" w:eastAsia="맑은 고딕"/>
-          <w:b/>
-          <w:sz w:val="20"/>
-        </w:rPr>
-        <w:t>옛 문서는 스캔한 뒤 글자로 바꿉니다</w:t>
-      </w:r>
+    </w:p>
+    <w:p>
+      <w:pPr>
+        <w:spacing w:before="0" w:after="3" w:line="240" w:lineRule="auto"/>
+        <w:ind w:left="0"/>
+      </w:pPr>
       <w:r>
         <w:rPr>
           <w:rFonts w:ascii="맑은 고딕" w:hAnsi="맑은 고딕" w:eastAsia="맑은 고딕"/>
           <w:sz w:val="20"/>
         </w:rPr>
+        <w:t>□ 녹음·옛 지도 디지털화</w:t>
       </w:r>
     </w:p>
     <w:p>
@@ -3213,7 +2991,7 @@
           <w:rFonts w:ascii="맑은 고딕" w:hAnsi="맑은 고딕" w:eastAsia="맑은 고딕"/>
           <w:sz w:val="20"/>
         </w:rPr>
-        <w:t>○ 'OCR(스캔한 사진을 컴퓨터가 읽는 글자로 바꾸는 기술)'을 사용합니다.</w:t>
+        <w:t>○ 구술 녹음은 'STT(음성을 글자로 바꾸는 받아쓰기 기술)'로 텍스트화 후 전문가 교정</w:t>
       </w:r>
     </w:p>
     <w:p>
@@ -3226,60 +3004,7 @@
           <w:rFonts w:ascii="맑은 고딕" w:hAnsi="맑은 고딕" w:eastAsia="맑은 고딕"/>
           <w:sz w:val="20"/>
         </w:rPr>
-        <w:t>○ 일본어 옛 글씨·손글씨는 일반 기술로는 안 되므로 전용 기술을 따로 개발합니다.</w:t>
-      </w:r>
-    </w:p>
-    <w:p>
-      <w:pPr>
-        <w:spacing w:before="0" w:after="3" w:line="240" w:lineRule="auto"/>
-        <w:ind w:left="0"/>
-      </w:pPr>
-      <w:r>
-        <w:rPr>
-          <w:rFonts w:ascii="맑은 고딕" w:hAnsi="맑은 고딕" w:eastAsia="맑은 고딕"/>
-          <w:sz w:val="20"/>
-        </w:rPr>
-        <w:t xml:space="preserve">□ </w:t>
-      </w:r>
-      <w:r>
-        <w:rPr>
-          <w:rFonts w:ascii="맑은 고딕" w:hAnsi="맑은 고딕" w:eastAsia="맑은 고딕"/>
-          <w:b/>
-          <w:sz w:val="20"/>
-        </w:rPr>
-        <w:t>녹음은 받아쓰기로, 옛 지도·사진은 고화질로</w:t>
-      </w:r>
-      <w:r>
-        <w:rPr>
-          <w:rFonts w:ascii="맑은 고딕" w:hAnsi="맑은 고딕" w:eastAsia="맑은 고딕"/>
-          <w:sz w:val="20"/>
-        </w:rPr>
-      </w:r>
-    </w:p>
-    <w:p>
-      <w:pPr>
-        <w:spacing w:before="0" w:after="3" w:line="240" w:lineRule="auto"/>
-        <w:ind w:left="283"/>
-      </w:pPr>
-      <w:r>
-        <w:rPr>
-          <w:rFonts w:ascii="맑은 고딕" w:hAnsi="맑은 고딕" w:eastAsia="맑은 고딕"/>
-          <w:sz w:val="20"/>
-        </w:rPr>
-        <w:t>○ 구술 녹음은 'STT(음성을 글자로 바꾸는 받아쓰기 기술)'로 글자화한 뒤 전문가가 교정합니다.</w:t>
-      </w:r>
-    </w:p>
-    <w:p>
-      <w:pPr>
-        <w:spacing w:before="0" w:after="3" w:line="240" w:lineRule="auto"/>
-        <w:ind w:left="283"/>
-      </w:pPr>
-      <w:r>
-        <w:rPr>
-          <w:rFonts w:ascii="맑은 고딕" w:hAnsi="맑은 고딕" w:eastAsia="맑은 고딕"/>
-          <w:sz w:val="20"/>
-        </w:rPr>
-        <w:t>○ 독도 옛 지도·필름은 전용 스캐너로 고화질 디지털화합니다.</w:t>
+        <w:t>○ 독도 옛 지도·필름은 전용 스캐너로 고화질 디지털화</w:t>
       </w:r>
     </w:p>
     <w:p>
@@ -3306,7 +3031,72 @@
           <w:rFonts w:ascii="맑은 고딕" w:hAnsi="맑은 고딕" w:eastAsia="맑은 고딕"/>
           <w:sz w:val="20"/>
         </w:rPr>
-        <w:t xml:space="preserve">□ </w:t>
+        <w:t>□ 자료별 꼬리표(메타데이터) 부여</w:t>
+      </w:r>
+    </w:p>
+    <w:p>
+      <w:pPr>
+        <w:spacing w:before="0" w:after="3" w:line="240" w:lineRule="auto"/>
+        <w:ind w:left="283"/>
+      </w:pPr>
+      <w:r>
+        <w:rPr>
+          <w:rFonts w:ascii="맑은 고딕" w:hAnsi="맑은 고딕" w:eastAsia="맑은 고딕"/>
+          <w:sz w:val="20"/>
+        </w:rPr>
+        <w:t>○ 모든 자료에 '누가·언제·어디서·무엇을' 정보 부여 → 컴퓨터 검색·연결 기반 확보</w:t>
+      </w:r>
+    </w:p>
+    <w:p>
+      <w:pPr>
+        <w:spacing w:before="0" w:after="3" w:line="240" w:lineRule="auto"/>
+        <w:ind w:left="0"/>
+      </w:pPr>
+      <w:r>
+        <w:rPr>
+          <w:rFonts w:ascii="맑은 고딕" w:hAnsi="맑은 고딕" w:eastAsia="맑은 고딕"/>
+          <w:sz w:val="20"/>
+        </w:rPr>
+        <w:t>□ 흩어진 자료의 인물·사건 중심 연결</w:t>
+      </w:r>
+    </w:p>
+    <w:p>
+      <w:pPr>
+        <w:spacing w:before="0" w:after="3" w:line="240" w:lineRule="auto"/>
+        <w:ind w:left="283"/>
+      </w:pPr>
+      <w:r>
+        <w:rPr>
+          <w:rFonts w:ascii="맑은 고딕" w:hAnsi="맑은 고딕" w:eastAsia="맑은 고딕"/>
+          <w:sz w:val="20"/>
+        </w:rPr>
+        <w:t>○ 인물·사건·장소를 잇는 '지식 구조(온톨로지)' 설계 → 흩어진 동일 인물 자료 자동 결합</w:t>
+      </w:r>
+    </w:p>
+    <w:p>
+      <w:pPr>
+        <w:spacing w:before="0" w:after="3" w:line="240" w:lineRule="auto"/>
+        <w:ind w:left="283"/>
+      </w:pPr>
+      <w:r>
+        <w:rPr>
+          <w:rFonts w:ascii="맑은 고딕" w:hAnsi="맑은 고딕" w:eastAsia="맑은 고딕"/>
+          <w:sz w:val="20"/>
+        </w:rPr>
+        <w:t>○ 한·일·영 3개 언어 용어사전 구축</w:t>
+      </w:r>
+    </w:p>
+    <w:p>
+      <w:pPr>
+        <w:spacing w:before="0" w:after="3" w:line="240" w:lineRule="auto"/>
+        <w:ind w:left="283"/>
+      </w:pPr>
+      <w:r>
+        <w:rPr>
+          <w:rFonts w:ascii="맑은 고딕" w:hAnsi="맑은 고딕" w:eastAsia="맑은 고딕"/>
+          <w:sz w:val="20"/>
+        </w:rPr>
+        <w:t xml:space="preserve">○ 데이터 표준·지식 구조 상세 → </w:t>
       </w:r>
       <w:r>
         <w:rPr>
@@ -3314,118 +3104,13 @@
           <w:b/>
           <w:sz w:val="20"/>
         </w:rPr>
-        <w:t>자료마다 꼬리표를 붙입니다</w:t>
+        <w:t>부록 5</w:t>
       </w:r>
       <w:r>
         <w:rPr>
           <w:rFonts w:ascii="맑은 고딕" w:hAnsi="맑은 고딕" w:eastAsia="맑은 고딕"/>
           <w:sz w:val="20"/>
         </w:rPr>
-      </w:r>
-    </w:p>
-    <w:p>
-      <w:pPr>
-        <w:spacing w:before="0" w:after="3" w:line="240" w:lineRule="auto"/>
-        <w:ind w:left="283"/>
-      </w:pPr>
-      <w:r>
-        <w:rPr>
-          <w:rFonts w:ascii="맑은 고딕" w:hAnsi="맑은 고딕" w:eastAsia="맑은 고딕"/>
-          <w:sz w:val="20"/>
-        </w:rPr>
-        <w:t>○ 모든 자료에 '누가·언제·어디서·무엇을'이라는 정보(메타데이터)를 붙여, 컴퓨터가 찾고</w:t>
-      </w:r>
-    </w:p>
-    <w:p>
-      <w:pPr>
-        <w:spacing w:before="0" w:after="3" w:line="240" w:lineRule="auto"/>
-        <w:ind w:left="0"/>
-      </w:pPr>
-      <w:r>
-        <w:rPr>
-          <w:rFonts w:ascii="맑은 고딕" w:hAnsi="맑은 고딕" w:eastAsia="맑은 고딕"/>
-          <w:sz w:val="20"/>
-        </w:rPr>
-        <w:t>연결할 수 있게 합니다.</w:t>
-      </w:r>
-    </w:p>
-    <w:p>
-      <w:pPr>
-        <w:spacing w:before="0" w:after="3" w:line="240" w:lineRule="auto"/>
-        <w:ind w:left="0"/>
-      </w:pPr>
-      <w:r>
-        <w:rPr>
-          <w:rFonts w:ascii="맑은 고딕" w:hAnsi="맑은 고딕" w:eastAsia="맑은 고딕"/>
-          <w:sz w:val="20"/>
-        </w:rPr>
-        <w:t xml:space="preserve">□ </w:t>
-      </w:r>
-      <w:r>
-        <w:rPr>
-          <w:rFonts w:ascii="맑은 고딕" w:hAnsi="맑은 고딕" w:eastAsia="맑은 고딕"/>
-          <w:b/>
-          <w:sz w:val="20"/>
-        </w:rPr>
-        <w:t>흩어진 자료를 같은 사람·사건으로 묶습니다</w:t>
-      </w:r>
-      <w:r>
-        <w:rPr>
-          <w:rFonts w:ascii="맑은 고딕" w:hAnsi="맑은 고딕" w:eastAsia="맑은 고딕"/>
-          <w:sz w:val="20"/>
-        </w:rPr>
-      </w:r>
-    </w:p>
-    <w:p>
-      <w:pPr>
-        <w:spacing w:before="0" w:after="3" w:line="240" w:lineRule="auto"/>
-        <w:ind w:left="283"/>
-      </w:pPr>
-      <w:r>
-        <w:rPr>
-          <w:rFonts w:ascii="맑은 고딕" w:hAnsi="맑은 고딕" w:eastAsia="맑은 고딕"/>
-          <w:sz w:val="20"/>
-        </w:rPr>
-        <w:t>○ 인물·사건·장소를 서로 잇는 '지식 구조(온톨로지)'를 설계합니다. 같은 사람의 자료가</w:t>
-      </w:r>
-    </w:p>
-    <w:p>
-      <w:pPr>
-        <w:spacing w:before="0" w:after="3" w:line="240" w:lineRule="auto"/>
-        <w:ind w:left="0"/>
-      </w:pPr>
-      <w:r>
-        <w:rPr>
-          <w:rFonts w:ascii="맑은 고딕" w:hAnsi="맑은 고딕" w:eastAsia="맑은 고딕"/>
-          <w:sz w:val="20"/>
-        </w:rPr>
-        <w:t>여러 곳에 흩어져 있어도 자동으로 한데 묶입니다.</w:t>
-      </w:r>
-    </w:p>
-    <w:p>
-      <w:pPr>
-        <w:spacing w:before="0" w:after="3" w:line="240" w:lineRule="auto"/>
-        <w:ind w:left="283"/>
-      </w:pPr>
-      <w:r>
-        <w:rPr>
-          <w:rFonts w:ascii="맑은 고딕" w:hAnsi="맑은 고딕" w:eastAsia="맑은 고딕"/>
-          <w:sz w:val="20"/>
-        </w:rPr>
-        <w:t>○ 한국어·일본어·영어 용어사전을 함께 만듭니다.</w:t>
-      </w:r>
-    </w:p>
-    <w:p>
-      <w:pPr>
-        <w:spacing w:before="0" w:after="3" w:line="240" w:lineRule="auto"/>
-        <w:ind w:left="0"/>
-      </w:pPr>
-      <w:r>
-        <w:rPr>
-          <w:rFonts w:ascii="맑은 고딕" w:hAnsi="맑은 고딕" w:eastAsia="맑은 고딕"/>
-          <w:sz w:val="20"/>
-        </w:rPr>
-        <w:t>(데이터 표준·지식 구조 상세 → 부록 5)</w:t>
       </w:r>
     </w:p>
     <w:p>
@@ -3452,87 +3137,85 @@
           <w:rFonts w:ascii="맑은 고딕" w:hAnsi="맑은 고딕" w:eastAsia="맑은 고딕"/>
           <w:sz w:val="20"/>
         </w:rPr>
-        <w:t xml:space="preserve">□ </w:t>
+        <w:t>□ 의미 기반 검색 (본 사업의 핵심)</w:t>
       </w:r>
-      <w:r>
-        <w:rPr>
-          <w:rFonts w:ascii="맑은 고딕" w:hAnsi="맑은 고딕" w:eastAsia="맑은 고딕"/>
-          <w:b/>
-          <w:sz w:val="20"/>
-        </w:rPr>
-        <w:t>뜻으로 찾는 검색 (이 사업의 핵심)</w:t>
-      </w:r>
+    </w:p>
+    <w:p>
+      <w:pPr>
+        <w:spacing w:before="0" w:after="3" w:line="240" w:lineRule="auto"/>
+        <w:ind w:left="283"/>
+      </w:pPr>
       <w:r>
         <w:rPr>
           <w:rFonts w:ascii="맑은 고딕" w:hAnsi="맑은 고딕" w:eastAsia="맑은 고딕"/>
           <w:sz w:val="20"/>
         </w:rPr>
+        <w:t>○ 단어가 정확히 일치하지 않아도 뜻이 통하는 자료 검색</w:t>
       </w:r>
     </w:p>
     <w:p>
       <w:pPr>
         <w:spacing w:before="0" w:after="3" w:line="240" w:lineRule="auto"/>
-        <w:ind w:left="283"/>
+        <w:ind w:left="567"/>
       </w:pPr>
       <w:r>
         <w:rPr>
           <w:rFonts w:ascii="맑은 고딕" w:hAnsi="맑은 고딕" w:eastAsia="맑은 고딕"/>
           <w:sz w:val="20"/>
         </w:rPr>
-        <w:t>○ 단어가 정확히 같지 않아도 '뜻이 통하는' 자료를 찾아줍니다.</w:t>
+        <w:t xml:space="preserve">  - 예: 인물명 하나로 강제동원·원폭·소송 자료를 분야 구분 없이 통합 제시</w:t>
       </w:r>
     </w:p>
     <w:p>
       <w:pPr>
         <w:spacing w:before="0" w:after="3" w:line="240" w:lineRule="auto"/>
-        <w:ind w:left="0"/>
+        <w:ind w:left="283"/>
       </w:pPr>
       <w:r>
         <w:rPr>
           <w:rFonts w:ascii="맑은 고딕" w:hAnsi="맑은 고딕" w:eastAsia="맑은 고딕"/>
           <w:sz w:val="20"/>
         </w:rPr>
-        <w:t>예: 피해자 이름 하나를 넣으면 강제동원·원폭·소송 자료를 분야 구분 없이 한 번에 보여줍니다.</w:t>
+        <w:t>○ 한국어 질의로 일본어·영어 자료까지 검색</w:t>
       </w:r>
     </w:p>
     <w:p>
       <w:pPr>
         <w:spacing w:before="0" w:after="3" w:line="240" w:lineRule="auto"/>
-        <w:ind w:left="283"/>
+        <w:ind w:left="0"/>
       </w:pPr>
       <w:r>
         <w:rPr>
           <w:rFonts w:ascii="맑은 고딕" w:hAnsi="맑은 고딕" w:eastAsia="맑은 고딕"/>
           <w:sz w:val="20"/>
         </w:rPr>
-        <w:t>○ 한국어로 물어도 일본어·영어 자료까지 찾아줍니다.</w:t>
+        <w:t>□ 자동 연결 및 관계도</w:t>
       </w:r>
     </w:p>
     <w:p>
       <w:pPr>
         <w:spacing w:before="0" w:after="3" w:line="240" w:lineRule="auto"/>
-        <w:ind w:left="0"/>
+        <w:ind w:left="283"/>
       </w:pPr>
       <w:r>
         <w:rPr>
           <w:rFonts w:ascii="맑은 고딕" w:hAnsi="맑은 고딕" w:eastAsia="맑은 고딕"/>
           <w:sz w:val="20"/>
         </w:rPr>
-        <w:t xml:space="preserve">□ </w:t>
+        <w:t>○ 자료 속 인물·장소·기관명을 AI가 자동 식별·태깅</w:t>
       </w:r>
-      <w:r>
-        <w:rPr>
-          <w:rFonts w:ascii="맑은 고딕" w:hAnsi="맑은 고딕" w:eastAsia="맑은 고딕"/>
-          <w:b/>
-          <w:sz w:val="20"/>
-        </w:rPr>
-        <w:t>자동 연결과 관계도</w:t>
-      </w:r>
+    </w:p>
+    <w:p>
+      <w:pPr>
+        <w:spacing w:before="0" w:after="3" w:line="240" w:lineRule="auto"/>
+        <w:ind w:left="283"/>
+      </w:pPr>
       <w:r>
         <w:rPr>
           <w:rFonts w:ascii="맑은 고딕" w:hAnsi="맑은 고딕" w:eastAsia="맑은 고딕"/>
           <w:sz w:val="20"/>
         </w:rPr>
+        <w:t>○ 인물–사건–자료를 잇는 '관계도(지식 그래프)'로 통합 탐색</w:t>
       </w:r>
     </w:p>
     <w:p>
@@ -3545,33 +3228,7 @@
           <w:rFonts w:ascii="맑은 고딕" w:hAnsi="맑은 고딕" w:eastAsia="맑은 고딕"/>
           <w:sz w:val="20"/>
         </w:rPr>
-        <w:t>○ 자료 속 사람·장소·기관 이름을 AI가 자동으로 찾아 표시합니다.</w:t>
-      </w:r>
-    </w:p>
-    <w:p>
-      <w:pPr>
-        <w:spacing w:before="0" w:after="3" w:line="240" w:lineRule="auto"/>
-        <w:ind w:left="283"/>
-      </w:pPr>
-      <w:r>
-        <w:rPr>
-          <w:rFonts w:ascii="맑은 고딕" w:hAnsi="맑은 고딕" w:eastAsia="맑은 고딕"/>
-          <w:sz w:val="20"/>
-        </w:rPr>
-        <w:t>○ 인물–사건–자료를 선으로 잇는 '관계도'로 한눈에 살펴볼 수 있습니다.</w:t>
-      </w:r>
-    </w:p>
-    <w:p>
-      <w:pPr>
-        <w:spacing w:before="0" w:after="3" w:line="240" w:lineRule="auto"/>
-        <w:ind w:left="283"/>
-      </w:pPr>
-      <w:r>
-        <w:rPr>
-          <w:rFonts w:ascii="맑은 고딕" w:hAnsi="맑은 고딕" w:eastAsia="맑은 고딕"/>
-          <w:sz w:val="20"/>
-        </w:rPr>
-        <w:t>○ 피해 지역 지도, 연도별 통계도 그림으로 보여줍니다.</w:t>
+        <w:t>○ 피해 지역 지도·연도별 통계 시각화</w:t>
       </w:r>
     </w:p>
     <w:p>
@@ -3598,7 +3255,7 @@
           <w:rFonts w:ascii="맑은 고딕" w:hAnsi="맑은 고딕" w:eastAsia="맑은 고딕"/>
           <w:sz w:val="20"/>
         </w:rPr>
-        <w:t>□ 전체 구성 (간단히)</w:t>
+        <w:t>□ 전체 구성</w:t>
       </w:r>
     </w:p>
     <w:p>
@@ -3615,7 +3272,7 @@
         </w:rPr>
         <w:t>[흩어진 자료]  →  [한곳에 모아 정리(통합DB)]  →  [AI가 찾고 연결]  →  [누구나 쓰는 누리집]</w:t>
         <w:br/>
-        <w:t xml:space="preserve"> 6대 분야 기관        꼬리표·지식구조로 정리        뜻으로 찾는 검색       시민·연구자·해외 이용자</w:t>
+        <w:t xml:space="preserve"> 6대 분야 기관        꼬리표·지식구조로 정리        의미 기반 검색       시민·연구자·해외 이용자</w:t>
       </w:r>
     </w:p>
     <w:p>
@@ -3628,21 +3285,20 @@
           <w:rFonts w:ascii="맑은 고딕" w:hAnsi="맑은 고딕" w:eastAsia="맑은 고딕"/>
           <w:sz w:val="20"/>
         </w:rPr>
-        <w:t xml:space="preserve">□ </w:t>
+        <w:t>□ 국내 정부 클라우드 보관 원칙</w:t>
       </w:r>
-      <w:r>
-        <w:rPr>
-          <w:rFonts w:ascii="맑은 고딕" w:hAnsi="맑은 고딕" w:eastAsia="맑은 고딕"/>
-          <w:b/>
-          <w:sz w:val="20"/>
-        </w:rPr>
-        <w:t>자료는 국내 정부 서버에 안전하게 보관합니다</w:t>
-      </w:r>
+    </w:p>
+    <w:p>
+      <w:pPr>
+        <w:spacing w:before="0" w:after="3" w:line="240" w:lineRule="auto"/>
+        <w:ind w:left="283"/>
+      </w:pPr>
       <w:r>
         <w:rPr>
           <w:rFonts w:ascii="맑은 고딕" w:hAnsi="맑은 고딕" w:eastAsia="맑은 고딕"/>
           <w:sz w:val="20"/>
         </w:rPr>
+        <w:t>○ 민감 피해자 자료는 해외 서버를 배제하고 국내 정부 클라우드(G-Cloud, 정부가 운영하는 국내 서버)에 보관 → 데이터 주권 확보</w:t>
       </w:r>
     </w:p>
     <w:p>
@@ -3655,33 +3311,7 @@
           <w:rFonts w:ascii="맑은 고딕" w:hAnsi="맑은 고딕" w:eastAsia="맑은 고딕"/>
           <w:sz w:val="20"/>
         </w:rPr>
-        <w:t>○ 민감한 피해자 자료는 해외 서버에 두지 않고 국내 정부 클라우드(G-Cloud, 정부가 운영하는</w:t>
-      </w:r>
-    </w:p>
-    <w:p>
-      <w:pPr>
-        <w:spacing w:before="0" w:after="3" w:line="240" w:lineRule="auto"/>
-        <w:ind w:left="0"/>
-      </w:pPr>
-      <w:r>
-        <w:rPr>
-          <w:rFonts w:ascii="맑은 고딕" w:hAnsi="맑은 고딕" w:eastAsia="맑은 고딕"/>
-          <w:sz w:val="20"/>
-        </w:rPr>
-        <w:t>국내 서버)에 보관합니다. — 우리 데이터를 우리가 지키기 위함입니다.</w:t>
-      </w:r>
-    </w:p>
-    <w:p>
-      <w:pPr>
-        <w:spacing w:before="0" w:after="3" w:line="240" w:lineRule="auto"/>
-        <w:ind w:left="283"/>
-      </w:pPr>
-      <w:r>
-        <w:rPr>
-          <w:rFonts w:ascii="맑은 고딕" w:hAnsi="맑은 고딕" w:eastAsia="맑은 고딕"/>
-          <w:sz w:val="20"/>
-        </w:rPr>
-        <w:t>○ AI도 가능한 한 국산 기술을 우선 사용합니다.</w:t>
+        <w:t>○ AI도 국산 기술 우선 적용</w:t>
       </w:r>
     </w:p>
     <w:p>
@@ -3733,21 +3363,20 @@
           <w:rFonts w:ascii="맑은 고딕" w:hAnsi="맑은 고딕" w:eastAsia="맑은 고딕"/>
           <w:sz w:val="20"/>
         </w:rPr>
-        <w:t xml:space="preserve">□ </w:t>
+        <w:t>□ 1단계(2027~2029): 통합 기반 구축</w:t>
       </w:r>
-      <w:r>
-        <w:rPr>
-          <w:rFonts w:ascii="맑은 고딕" w:hAnsi="맑은 고딕" w:eastAsia="맑은 고딕"/>
-          <w:b/>
-          <w:sz w:val="20"/>
-        </w:rPr>
-        <w:t>1단계 (2027~2029): 기반 만들기</w:t>
-      </w:r>
+    </w:p>
+    <w:p>
+      <w:pPr>
+        <w:spacing w:before="0" w:after="3" w:line="240" w:lineRule="auto"/>
+        <w:ind w:left="283"/>
+      </w:pPr>
       <w:r>
         <w:rPr>
           <w:rFonts w:ascii="맑은 고딕" w:hAnsi="맑은 고딕" w:eastAsia="맑은 고딕"/>
           <w:sz w:val="20"/>
         </w:rPr>
+        <w:t>○ 2027: 6대 도메인 자료 전수 조사, 수행기관 확정, 범부처 TF 출범, 노후 녹음매체 긴급 보존</w:t>
       </w:r>
     </w:p>
     <w:p>
@@ -3760,7 +3389,7 @@
           <w:rFonts w:ascii="맑은 고딕" w:hAnsi="맑은 고딕" w:eastAsia="맑은 고딕"/>
           <w:sz w:val="20"/>
         </w:rPr>
-        <w:t>○ 2027: 6대 분야 자료 전수 조사, 실무조직 확정, 부처 협력기구 출범, 급한 녹음테이프 보존</w:t>
+        <w:t>○ 2028: 자료 정리 체계 확정, 시범 DB 구축, 구술·소송기록 디지털화, 검색엔진 베타</w:t>
       </w:r>
     </w:p>
     <w:p>
@@ -3773,60 +3402,33 @@
           <w:rFonts w:ascii="맑은 고딕" w:hAnsi="맑은 고딕" w:eastAsia="맑은 고딕"/>
           <w:sz w:val="20"/>
         </w:rPr>
-        <w:t>○ 2028: 자료 정리 체계 확정, 시범 자료관 구축, 구술·소송기록 디지털화, 검색 시범판</w:t>
+        <w:t>○ 2029: 시민단체 자료 디지털화 완료, 기존 아카이브(독도·위안부) 연계, 1단계 성과 평가</w:t>
       </w:r>
     </w:p>
     <w:p>
       <w:pPr>
         <w:spacing w:before="0" w:after="3" w:line="240" w:lineRule="auto"/>
-        <w:ind w:left="283"/>
+        <w:ind w:left="0"/>
       </w:pPr>
       <w:r>
         <w:rPr>
           <w:rFonts w:ascii="맑은 고딕" w:hAnsi="맑은 고딕" w:eastAsia="맑은 고딕"/>
           <w:sz w:val="20"/>
         </w:rPr>
-        <w:t>○ 2029: 시민단체 자료 디지털화 완료, 기존 자료관(독도·위안부) 연결, 1단계 평가</w:t>
+        <w:t>□ 2단계(2030~2032): AI 고도화 및 서비스 확산</w:t>
       </w:r>
     </w:p>
     <w:p>
       <w:pPr>
         <w:spacing w:before="0" w:after="3" w:line="240" w:lineRule="auto"/>
-        <w:ind w:left="0"/>
+        <w:ind w:left="283"/>
       </w:pPr>
       <w:r>
         <w:rPr>
           <w:rFonts w:ascii="맑은 고딕" w:hAnsi="맑은 고딕" w:eastAsia="맑은 고딕"/>
           <w:sz w:val="20"/>
         </w:rPr>
-        <w:t xml:space="preserve">□ </w:t>
-      </w:r>
-      <w:r>
-        <w:rPr>
-          <w:rFonts w:ascii="맑은 고딕" w:hAnsi="맑은 고딕" w:eastAsia="맑은 고딕"/>
-          <w:b/>
-          <w:sz w:val="20"/>
-        </w:rPr>
-        <w:t>2단계 (2030~2032): AI 고도화와 서비스 확산</w:t>
-      </w:r>
-      <w:r>
-        <w:rPr>
-          <w:rFonts w:ascii="맑은 고딕" w:hAnsi="맑은 고딕" w:eastAsia="맑은 고딕"/>
-          <w:sz w:val="20"/>
-        </w:rPr>
-      </w:r>
-    </w:p>
-    <w:p>
-      <w:pPr>
-        <w:spacing w:before="0" w:after="3" w:line="240" w:lineRule="auto"/>
-        <w:ind w:left="283"/>
-      </w:pPr>
-      <w:r>
-        <w:rPr>
-          <w:rFonts w:ascii="맑은 고딕" w:hAnsi="맑은 고딕" w:eastAsia="맑은 고딕"/>
-          <w:sz w:val="20"/>
-        </w:rPr>
-        <w:t>○ 2030: AI 통합 검색·관계도 개발, 아카이브넷 시범 공개</w:t>
+        <w:t>○ 2030: AI 사안 횡단 검색·관계도 개발, 아카이브넷 시범 공개</w:t>
       </w:r>
     </w:p>
     <w:p>
@@ -3852,7 +3454,7 @@
           <w:rFonts w:ascii="맑은 고딕" w:hAnsi="맑은 고딕" w:eastAsia="맑은 고딕"/>
           <w:sz w:val="20"/>
         </w:rPr>
-        <w:t>○ 2032: 완성·안정화, 지속 운영 체계로 넘김</w:t>
+        <w:t>○ 2032: 완성·안정화, 지속 운영 체계 이관</w:t>
       </w:r>
     </w:p>
     <w:p>
@@ -4094,7 +3696,7 @@
                 <w:rFonts w:ascii="맑은 고딕" w:hAnsi="맑은 고딕" w:eastAsia="맑은 고딕"/>
                 <w:sz w:val="18"/>
               </w:rPr>
-              <w:t>시민단체 자료·기존 자료관 연결</w:t>
+              <w:t>시민단체 자료·기존 아카이브 연계</w:t>
             </w:r>
           </w:p>
         </w:tc>
@@ -4317,7 +3919,7 @@
           <w:rFonts w:ascii="맑은 고딕" w:hAnsi="맑은 고딕" w:eastAsia="맑은 고딕"/>
           <w:sz w:val="20"/>
         </w:rPr>
-        <w:t>□ 연 8억 원의 쓰임새 (한 해 기준)</w:t>
+        <w:t>□ 연 8억 원 항목별 배분</w:t>
       </w:r>
     </w:p>
     <w:tbl>
@@ -4640,7 +4242,7 @@
                 <w:rFonts w:ascii="맑은 고딕" w:hAnsi="맑은 고딕" w:eastAsia="맑은 고딕"/>
                 <w:sz w:val="18"/>
               </w:rPr>
-              <w:t>자료관 개발, 서버, 유지보수</w:t>
+              <w:t>아카이브 개발, 서버, 유지보수</w:t>
             </w:r>
           </w:p>
         </w:tc>
@@ -4870,7 +4472,7 @@
                 <w:rFonts w:ascii="맑은 고딕" w:hAnsi="맑은 고딕" w:eastAsia="맑은 고딕"/>
                 <w:sz w:val="18"/>
               </w:rPr>
-              <w:t>일본어 자료 번역</w:t>
+              <w:t>일본어 자료 번역·해제</w:t>
             </w:r>
           </w:p>
         </w:tc>
@@ -5112,33 +4714,34 @@
           <w:rFonts w:ascii="맑은 고딕" w:hAnsi="맑은 고딕" w:eastAsia="맑은 고딕"/>
           <w:sz w:val="20"/>
         </w:rPr>
-        <w:t>○ 사라질 위험이 큰 자료부터 처리하기 위해, 1단계(2027~2029)에 자료 수집·디지털화 예산을</w:t>
+        <w:t>○ 자료 소멸 위험 대응을 위해 1단계(2027~2029)에 자료 수집·디지털화 예산 집중 배정</w:t>
       </w:r>
     </w:p>
     <w:p>
       <w:pPr>
         <w:spacing w:before="0" w:after="3" w:line="240" w:lineRule="auto"/>
-        <w:ind w:left="0"/>
+        <w:ind w:left="283"/>
       </w:pPr>
       <w:r>
         <w:rPr>
           <w:rFonts w:ascii="맑은 고딕" w:hAnsi="맑은 고딕" w:eastAsia="맑은 고딕"/>
           <w:sz w:val="20"/>
         </w:rPr>
-        <w:t>집중 배정합니다.</w:t>
+        <w:t xml:space="preserve">○ 연도별 예산 배분표, 단가 산출 근거 → </w:t>
       </w:r>
-    </w:p>
-    <w:p>
-      <w:pPr>
-        <w:spacing w:before="0" w:after="3" w:line="240" w:lineRule="auto"/>
-        <w:ind w:left="0"/>
-      </w:pPr>
+      <w:r>
+        <w:rPr>
+          <w:rFonts w:ascii="맑은 고딕" w:hAnsi="맑은 고딕" w:eastAsia="맑은 고딕"/>
+          <w:b/>
+          <w:sz w:val="20"/>
+        </w:rPr>
+        <w:t>부록 6</w:t>
+      </w:r>
       <w:r>
         <w:rPr>
           <w:rFonts w:ascii="맑은 고딕" w:hAnsi="맑은 고딕" w:eastAsia="맑은 고딕"/>
           <w:sz w:val="20"/>
         </w:rPr>
-        <w:t>(연도별 예산 배분표, 단가 산출 근거 → 부록 6)</w:t>
       </w:r>
     </w:p>
     <w:p>
@@ -5165,7 +4768,7 @@
           <w:rFonts w:ascii="맑은 고딕" w:hAnsi="맑은 고딕" w:eastAsia="맑은 고딕"/>
           <w:sz w:val="20"/>
         </w:rPr>
-        <w:t>□ 1단계가 끝나는 2029년에 외부 전문가가 성과를 평가하고 2단계 계획을 조정합니다.</w:t>
+        <w:t>□ 1단계 종료(2029) 시 외부 전문가 성과 평가 후 2단계 계획 조정</w:t>
       </w:r>
     </w:p>
     <w:p>
@@ -5178,7 +4781,7 @@
           <w:rFonts w:ascii="맑은 고딕" w:hAnsi="맑은 고딕" w:eastAsia="맑은 고딕"/>
           <w:sz w:val="20"/>
         </w:rPr>
-        <w:t>□ 6년 뒤에는 국가기록원이 자료관을 넘겨받아 계속 운영하고, 운영비는 정부 예산에 반영합니다.</w:t>
+        <w:t>□ 6개년 후 국가기록원이 아카이브 이관·운영, 운영비 정부 예산 반영</w:t>
       </w:r>
     </w:p>
     <w:p>
@@ -5230,33 +4833,60 @@
           <w:rFonts w:ascii="맑은 고딕" w:hAnsi="맑은 고딕" w:eastAsia="맑은 고딕"/>
           <w:sz w:val="20"/>
         </w:rPr>
-        <w:t>□ 한일 과거사 업무가 분야마다 다른 부처로 나뉘어, 전체를 책임지고 이끄는 곳이 없습니다.</w:t>
+        <w:t>□ 한일 과거사 업무가 분야별로 6개 부처에 분산 → 전체 총괄 주체 부재</w:t>
       </w:r>
     </w:p>
     <w:p>
       <w:pPr>
         <w:spacing w:before="0" w:after="3" w:line="240" w:lineRule="auto"/>
-        <w:ind w:left="0"/>
+        <w:ind w:left="283"/>
       </w:pPr>
       <w:r>
         <w:rPr>
           <w:rFonts w:ascii="맑은 고딕" w:hAnsi="맑은 고딕" w:eastAsia="맑은 고딕"/>
           <w:sz w:val="20"/>
         </w:rPr>
-        <w:t>그래서 비슷한 자료관을 부처마다 따로 만들고, 서로 연결도 안 됩니다.</w:t>
+        <w:t>○ 부처별 유사 아카이브 중복 구축, 상호 연계 부재로 예산 비효율</w:t>
       </w:r>
     </w:p>
     <w:p>
       <w:pPr>
         <w:spacing w:before="0" w:after="3" w:line="240" w:lineRule="auto"/>
-        <w:ind w:left="0"/>
+        <w:ind w:left="283"/>
       </w:pPr>
       <w:r>
         <w:rPr>
           <w:rFonts w:ascii="맑은 고딕" w:hAnsi="맑은 고딕" w:eastAsia="맑은 고딕"/>
           <w:sz w:val="20"/>
         </w:rPr>
-        <w:t>(분야별 소관 부처·법령·기관 전체표 → 부록 1)</w:t>
+        <w:t>○ 동일 부정 논리에 분야별·부처별 분산 대응</w:t>
+      </w:r>
+    </w:p>
+    <w:p>
+      <w:pPr>
+        <w:spacing w:before="0" w:after="3" w:line="240" w:lineRule="auto"/>
+        <w:ind w:left="283"/>
+      </w:pPr>
+      <w:r>
+        <w:rPr>
+          <w:rFonts w:ascii="맑은 고딕" w:hAnsi="맑은 고딕" w:eastAsia="맑은 고딕"/>
+          <w:sz w:val="20"/>
+        </w:rPr>
+        <w:t xml:space="preserve">○ 분야별 소관 부처·법령·기관 전체표 → </w:t>
+      </w:r>
+      <w:r>
+        <w:rPr>
+          <w:rFonts w:ascii="맑은 고딕" w:hAnsi="맑은 고딕" w:eastAsia="맑은 고딕"/>
+          <w:b/>
+          <w:sz w:val="20"/>
+        </w:rPr>
+        <w:t>부록 1</w:t>
+      </w:r>
+      <w:r>
+        <w:rPr>
+          <w:rFonts w:ascii="맑은 고딕" w:hAnsi="맑은 고딕" w:eastAsia="맑은 고딕"/>
+          <w:sz w:val="20"/>
+        </w:rPr>
       </w:r>
     </w:p>
     <w:p>
@@ -5283,21 +4913,20 @@
           <w:rFonts w:ascii="맑은 고딕" w:hAnsi="맑은 고딕" w:eastAsia="맑은 고딕"/>
           <w:sz w:val="20"/>
         </w:rPr>
-        <w:t xml:space="preserve">□ </w:t>
+        <w:t>□ 총괄은 국무조정실, 실무는 행정안전부(국가기록원)</w:t>
       </w:r>
-      <w:r>
-        <w:rPr>
-          <w:rFonts w:ascii="맑은 고딕" w:hAnsi="맑은 고딕" w:eastAsia="맑은 고딕"/>
-          <w:b/>
-          <w:sz w:val="20"/>
-        </w:rPr>
-        <w:t>총괄은 국무조정실, 실무는 행정안전부(국가기록원)가 맡습니다.</w:t>
-      </w:r>
+    </w:p>
+    <w:p>
+      <w:pPr>
+        <w:spacing w:before="0" w:after="3" w:line="240" w:lineRule="auto"/>
+        <w:ind w:left="283"/>
+      </w:pPr>
       <w:r>
         <w:rPr>
           <w:rFonts w:ascii="맑은 고딕" w:hAnsi="맑은 고딕" w:eastAsia="맑은 고딕"/>
           <w:sz w:val="20"/>
         </w:rPr>
+        <w:t>○ 한일 과거사는 단일 부처 소관을 초과 → 국무조정실의 정책 조정 기능 활용 필요</w:t>
       </w:r>
     </w:p>
     <w:p>
@@ -5310,63 +4939,20 @@
           <w:rFonts w:ascii="맑은 고딕" w:hAnsi="맑은 고딕" w:eastAsia="맑은 고딕"/>
           <w:sz w:val="20"/>
         </w:rPr>
-        <w:t xml:space="preserve">○ 한일 과거사는 한 부처가 다 못 하므로, 여러 부처를 조정하는 </w:t>
+        <w:t>○ 실제 아카이브 구축·운영은 국가기록원(행안부) 수행이 효율적</w:t>
       </w:r>
-      <w:r>
-        <w:rPr>
-          <w:rFonts w:ascii="맑은 고딕" w:hAnsi="맑은 고딕" w:eastAsia="맑은 고딕"/>
-          <w:b/>
-          <w:sz w:val="20"/>
-        </w:rPr>
-        <w:t>국무조정실</w:t>
-      </w:r>
+    </w:p>
+    <w:p>
+      <w:pPr>
+        <w:spacing w:before="0" w:after="3" w:line="240" w:lineRule="auto"/>
+        <w:ind w:left="0"/>
+      </w:pPr>
       <w:r>
         <w:rPr>
           <w:rFonts w:ascii="맑은 고딕" w:hAnsi="맑은 고딕" w:eastAsia="맑은 고딕"/>
           <w:sz w:val="20"/>
         </w:rPr>
-        <w:t>이 총괄합니다.</w:t>
-      </w:r>
-    </w:p>
-    <w:p>
-      <w:pPr>
-        <w:spacing w:before="0" w:after="3" w:line="240" w:lineRule="auto"/>
-        <w:ind w:left="283"/>
-      </w:pPr>
-      <w:r>
-        <w:rPr>
-          <w:rFonts w:ascii="맑은 고딕" w:hAnsi="맑은 고딕" w:eastAsia="맑은 고딕"/>
-          <w:sz w:val="20"/>
-        </w:rPr>
-        <w:t xml:space="preserve">○ 실제 자료관을 만들고 운영하는 일은 </w:t>
-      </w:r>
-      <w:r>
-        <w:rPr>
-          <w:rFonts w:ascii="맑은 고딕" w:hAnsi="맑은 고딕" w:eastAsia="맑은 고딕"/>
-          <w:b/>
-          <w:sz w:val="20"/>
-        </w:rPr>
-        <w:t>국가기록원(행안부)</w:t>
-      </w:r>
-      <w:r>
-        <w:rPr>
-          <w:rFonts w:ascii="맑은 고딕" w:hAnsi="맑은 고딕" w:eastAsia="맑은 고딕"/>
-          <w:sz w:val="20"/>
-        </w:rPr>
-        <w:t>이 맡는 것이 가장 적합합니다.</w:t>
-      </w:r>
-    </w:p>
-    <w:p>
-      <w:pPr>
-        <w:spacing w:before="0" w:after="3" w:line="240" w:lineRule="auto"/>
-        <w:ind w:left="0"/>
-      </w:pPr>
-      <w:r>
-        <w:rPr>
-          <w:rFonts w:ascii="맑은 고딕" w:hAnsi="맑은 고딕" w:eastAsia="맑은 고딕"/>
-          <w:sz w:val="20"/>
-        </w:rPr>
-        <w:t>□ 왜 행안부(국가기록원)가 실무를 맡나?</w:t>
+        <w:t>□ 행안부(국가기록원) 실무 수행의 적합성</w:t>
       </w:r>
     </w:p>
     <w:tbl>
@@ -5398,7 +4984,7 @@
                 <w:color w:val="FFFFFF"/>
                 <w:sz w:val="18"/>
               </w:rPr>
-              <w:t>이유</w:t>
+              <w:t>근거</w:t>
             </w:r>
           </w:p>
         </w:tc>
@@ -5419,7 +5005,7 @@
                 <w:color w:val="FFFFFF"/>
                 <w:sz w:val="18"/>
               </w:rPr>
-              <w:t>설명</w:t>
+              <w:t>내용</w:t>
             </w:r>
           </w:p>
         </w:tc>
@@ -5457,7 +5043,7 @@
                 <w:rFonts w:ascii="맑은 고딕" w:hAnsi="맑은 고딕" w:eastAsia="맑은 고딕"/>
                 <w:sz w:val="18"/>
               </w:rPr>
-              <w:t>국가기록원이 공공기록물 디지털화·관리의 법적 책임 기관</w:t>
+              <w:t>공공기록물 디지털화·관리의 법적 책임 기관(국가기록원) 보유</w:t>
             </w:r>
           </w:p>
         </w:tc>
@@ -5497,7 +5083,7 @@
                 <w:rFonts w:ascii="맑은 고딕" w:hAnsi="맑은 고딕" w:eastAsia="맑은 고딕"/>
                 <w:sz w:val="18"/>
               </w:rPr>
-              <w:t>강제동원 판정자료 22만 건 등 가장 많은 과거사 자료 보유</w:t>
+              <w:t>강제동원 판정자료 22만 건 등 최대 규모 과거사 자료 보유</w:t>
             </w:r>
           </w:p>
         </w:tc>
@@ -5535,7 +5121,7 @@
                 <w:rFonts w:ascii="맑은 고딕" w:hAnsi="맑은 고딕" w:eastAsia="맑은 고딕"/>
                 <w:sz w:val="18"/>
               </w:rPr>
-              <w:t>대규모 스캔·보존 장비와 전문 인력을 이미 갖춤</w:t>
+              <w:t>대규모 스캔·보존 장비 및 전문 인력 기보유</w:t>
             </w:r>
           </w:p>
         </w:tc>
@@ -5592,7 +5178,7 @@
           <w:rFonts w:ascii="맑은 고딕" w:hAnsi="맑은 고딕" w:eastAsia="맑은 고딕"/>
           <w:sz w:val="20"/>
         </w:rPr>
-        <w:t>○ 다만 역사 연구·국제 대응은 교육부(동북아역사재단·국사편찬위)·외교부가 함께 돕습니다.</w:t>
+        <w:t>○ 다만 역사 연구·국제 대응은 교육부(동북아역사재단·국사편찬위)·외교부가 협력 보완</w:t>
       </w:r>
     </w:p>
     <w:p>
@@ -5737,7 +5323,7 @@
                 <w:rFonts w:ascii="맑은 고딕" w:hAnsi="맑은 고딕" w:eastAsia="맑은 고딕"/>
                 <w:sz w:val="18"/>
               </w:rPr>
-              <w:t>실무 총괄, 자료관 구축·운영, 강제동원·식민피해 자료</w:t>
+              <w:t>실무 총괄, 아카이브 구축·운영, 강제동원·식민피해 자료</w:t>
             </w:r>
           </w:p>
         </w:tc>
@@ -5983,7 +5569,7 @@
           <w:rFonts w:ascii="맑은 고딕" w:hAnsi="맑은 고딕" w:eastAsia="맑은 고딕"/>
           <w:sz w:val="20"/>
         </w:rPr>
-        <w:t>○ 추진위원회는 반기 1회, 분야별 실무팀은 분기 1회 모입니다.</w:t>
+        <w:t>○ 추진위원회 반기 1회, 분야별 실무팀 분기 1회 운영</w:t>
       </w:r>
     </w:p>
     <w:p>
@@ -5996,47 +5582,20 @@
           <w:rFonts w:ascii="맑은 고딕" w:hAnsi="맑은 고딕" w:eastAsia="맑은 고딕"/>
           <w:sz w:val="20"/>
         </w:rPr>
-        <w:t xml:space="preserve">□ </w:t>
+        <w:t>□ 선행 법령 정비 과제</w:t>
       </w:r>
-      <w:r>
-        <w:rPr>
-          <w:rFonts w:ascii="맑은 고딕" w:hAnsi="맑은 고딕" w:eastAsia="맑은 고딕"/>
-          <w:b/>
-          <w:sz w:val="20"/>
-        </w:rPr>
-        <w:t>함께 추진해야 할 숙제: 법 정비</w:t>
-      </w:r>
+    </w:p>
+    <w:p>
+      <w:pPr>
+        <w:spacing w:before="0" w:after="3" w:line="240" w:lineRule="auto"/>
+        <w:ind w:left="283"/>
+      </w:pPr>
       <w:r>
         <w:rPr>
           <w:rFonts w:ascii="맑은 고딕" w:hAnsi="맑은 고딕" w:eastAsia="맑은 고딕"/>
           <w:sz w:val="20"/>
         </w:rPr>
-      </w:r>
-    </w:p>
-    <w:p>
-      <w:pPr>
-        <w:spacing w:before="0" w:after="3" w:line="240" w:lineRule="auto"/>
-        <w:ind w:left="283"/>
-      </w:pPr>
-      <w:r>
-        <w:rPr>
-          <w:rFonts w:ascii="맑은 고딕" w:hAnsi="맑은 고딕" w:eastAsia="맑은 고딕"/>
-          <w:sz w:val="20"/>
-        </w:rPr>
-        <w:t>○ 강제동원 판정자료 22만 건은 현재 법(개인정보 보호법 등)상 전면 공개가 어렵습니다.</w:t>
-      </w:r>
-    </w:p>
-    <w:p>
-      <w:pPr>
-        <w:spacing w:before="0" w:after="3" w:line="240" w:lineRule="auto"/>
-        <w:ind w:left="0"/>
-      </w:pPr>
-      <w:r>
-        <w:rPr>
-          <w:rFonts w:ascii="맑은 고딕" w:hAnsi="맑은 고딕" w:eastAsia="맑은 고딕"/>
-          <w:sz w:val="20"/>
-        </w:rPr>
-        <w:t>사업과 함께 법을 정비해야 합니다. (2027 연구 → 2028 입법 → 2029 단계적 공개)</w:t>
+        <w:t>○ 강제동원 판정자료 22만 건은 현행법(개인정보 보호법 등)상 전면 공개 제한 → 사업과 병행하여 법령 정비 필수 (2027 연구 → 2028 입법 → 2029 단계적 공개)</w:t>
       </w:r>
     </w:p>
     <w:p>
@@ -6063,7 +5622,46 @@
           <w:rFonts w:ascii="맑은 고딕" w:hAnsi="맑은 고딕" w:eastAsia="맑은 고딕"/>
           <w:sz w:val="20"/>
         </w:rPr>
-        <w:t xml:space="preserve">□ 여러 방안을 검토한 결과, </w:t>
+        <w:t>□ 검토 결과 국가기록원 내 전담팀 신설 방안 권고</w:t>
+      </w:r>
+    </w:p>
+    <w:p>
+      <w:pPr>
+        <w:spacing w:before="0" w:after="3" w:line="240" w:lineRule="auto"/>
+        <w:ind w:left="283"/>
+      </w:pPr>
+      <w:r>
+        <w:rPr>
+          <w:rFonts w:ascii="맑은 고딕" w:hAnsi="맑은 고딕" w:eastAsia="맑은 고딕"/>
+          <w:sz w:val="20"/>
+        </w:rPr>
+        <w:t>○ 근거: 대규모 디지털화 경험·장비·인력 보유, 정부 클라우드 연계 용이, 책임 소재 명확</w:t>
+      </w:r>
+    </w:p>
+    <w:p>
+      <w:pPr>
+        <w:spacing w:before="0" w:after="3" w:line="240" w:lineRule="auto"/>
+        <w:ind w:left="283"/>
+      </w:pPr>
+      <w:r>
+        <w:rPr>
+          <w:rFonts w:ascii="맑은 고딕" w:hAnsi="맑은 고딕" w:eastAsia="맑은 고딕"/>
+          <w:sz w:val="20"/>
+        </w:rPr>
+        <w:t>○ 부족한 역사·국제 전문성은 타 기관 협력으로 보완</w:t>
+      </w:r>
+    </w:p>
+    <w:p>
+      <w:pPr>
+        <w:spacing w:before="0" w:after="3" w:line="240" w:lineRule="auto"/>
+        <w:ind w:left="283"/>
+      </w:pPr>
+      <w:r>
+        <w:rPr>
+          <w:rFonts w:ascii="맑은 고딕" w:hAnsi="맑은 고딕" w:eastAsia="맑은 고딕"/>
+          <w:sz w:val="20"/>
+        </w:rPr>
+        <w:t xml:space="preserve">○ 검토한 4개 방안 비교 → </w:t>
       </w:r>
       <w:r>
         <w:rPr>
@@ -6071,53 +5669,13 @@
           <w:b/>
           <w:sz w:val="20"/>
         </w:rPr>
-        <w:t>국가기록원 안에 전담팀을 새로 만드는 방안</w:t>
+        <w:t>부록 5</w:t>
       </w:r>
       <w:r>
         <w:rPr>
           <w:rFonts w:ascii="맑은 고딕" w:hAnsi="맑은 고딕" w:eastAsia="맑은 고딕"/>
           <w:sz w:val="20"/>
         </w:rPr>
-        <w:t>을 권고합니다.</w:t>
-      </w:r>
-    </w:p>
-    <w:p>
-      <w:pPr>
-        <w:spacing w:before="0" w:after="3" w:line="240" w:lineRule="auto"/>
-        <w:ind w:left="283"/>
-      </w:pPr>
-      <w:r>
-        <w:rPr>
-          <w:rFonts w:ascii="맑은 고딕" w:hAnsi="맑은 고딕" w:eastAsia="맑은 고딕"/>
-          <w:sz w:val="20"/>
-        </w:rPr>
-        <w:t>○ 이유: 대규모 디지털화 경험·장비·인력을 이미 갖추었고, 정부 클라우드 연결이 쉬우며,</w:t>
-      </w:r>
-    </w:p>
-    <w:p>
-      <w:pPr>
-        <w:spacing w:before="0" w:after="3" w:line="240" w:lineRule="auto"/>
-        <w:ind w:left="0"/>
-      </w:pPr>
-      <w:r>
-        <w:rPr>
-          <w:rFonts w:ascii="맑은 고딕" w:hAnsi="맑은 고딕" w:eastAsia="맑은 고딕"/>
-          <w:sz w:val="20"/>
-        </w:rPr>
-        <w:t>책임 소재가 분명하기 때문입니다. 부족한 역사·국제 전문성은 다른 기관 협력으로 채웁니다.</w:t>
-      </w:r>
-    </w:p>
-    <w:p>
-      <w:pPr>
-        <w:spacing w:before="0" w:after="3" w:line="240" w:lineRule="auto"/>
-        <w:ind w:left="0"/>
-      </w:pPr>
-      <w:r>
-        <w:rPr>
-          <w:rFonts w:ascii="맑은 고딕" w:hAnsi="맑은 고딕" w:eastAsia="맑은 고딕"/>
-          <w:sz w:val="20"/>
-        </w:rPr>
-        <w:t>(검토한 4개 방안 비교 → 부록 5)</w:t>
       </w:r>
     </w:p>
     <w:p>
@@ -6287,7 +5845,7 @@
                 <w:rFonts w:ascii="맑은 고딕" w:hAnsi="맑은 고딕" w:eastAsia="맑은 고딕"/>
                 <w:sz w:val="18"/>
               </w:rPr>
-              <w:t>실무 총괄, 공공기록 연결</w:t>
+              <w:t>실무 총괄, 공공기록 연계</w:t>
             </w:r>
           </w:p>
         </w:tc>
@@ -6402,7 +5960,7 @@
                 <w:rFonts w:ascii="맑은 고딕" w:hAnsi="맑은 고딕" w:eastAsia="맑은 고딕"/>
                 <w:sz w:val="18"/>
               </w:rPr>
-              <w:t>위안부 자료관 연결</w:t>
+              <w:t>위안부 아카이브 연계</w:t>
             </w:r>
           </w:p>
         </w:tc>
@@ -6461,7 +6019,7 @@
                 <w:rFonts w:ascii="맑은 고딕" w:hAnsi="맑은 고딕" w:eastAsia="맑은 고딕"/>
                 <w:sz w:val="18"/>
               </w:rPr>
-              <w:t>독도·교과서 자료, 역사넷 연결</w:t>
+              <w:t>독도·교과서 자료, 역사넷 연계</w:t>
             </w:r>
           </w:p>
         </w:tc>
@@ -6663,20 +6221,20 @@
           <w:rFonts w:ascii="맑은 고딕" w:hAnsi="맑은 고딕" w:eastAsia="맑은 고딕"/>
           <w:sz w:val="20"/>
         </w:rPr>
-        <w:t>□ 오랫동안 자료를 모아온 민간단체와 협약을 맺어 자료를 제공받습니다.</w:t>
+        <w:t>□ 자료를 장기간 축적한 민간단체와 협약 체결로 자료 제공받음</w:t>
       </w:r>
     </w:p>
     <w:p>
       <w:pPr>
         <w:spacing w:before="0" w:after="3" w:line="240" w:lineRule="auto"/>
-        <w:ind w:left="0"/>
+        <w:ind w:left="283"/>
       </w:pPr>
       <w:r>
         <w:rPr>
           <w:rFonts w:ascii="맑은 고딕" w:hAnsi="맑은 고딕" w:eastAsia="맑은 고딕"/>
           <w:sz w:val="20"/>
         </w:rPr>
-        <w:t>민간단체는 '사업을 맡는 주체'가 아니라 '자료를 제공하는 협력 기관'입니다.</w:t>
+        <w:t>○ 민간단체는 '사업 수행 주체'가 아닌 '자료 제공 협력기관'으로 위치</w:t>
       </w:r>
     </w:p>
     <w:p>
@@ -6689,20 +6247,7 @@
           <w:rFonts w:ascii="맑은 고딕" w:hAnsi="맑은 고딕" w:eastAsia="맑은 고딕"/>
           <w:sz w:val="20"/>
         </w:rPr>
-        <w:t>○ 민족문제연구소(강제동원 구술·소송 기록), 정의기억연대(위안부 증언), 태평양전쟁피해자</w:t>
-      </w:r>
-    </w:p>
-    <w:p>
-      <w:pPr>
-        <w:spacing w:before="0" w:after="3" w:line="240" w:lineRule="auto"/>
-        <w:ind w:left="0"/>
-      </w:pPr>
-      <w:r>
-        <w:rPr>
-          <w:rFonts w:ascii="맑은 고딕" w:hAnsi="맑은 고딕" w:eastAsia="맑은 고딕"/>
-          <w:sz w:val="20"/>
-        </w:rPr>
-        <w:t>보상추진협의회, 한국원폭피해자협회 등</w:t>
+        <w:t>○ 민족문제연구소(강제동원 구술·소송), 정의기억연대(위안부 증언), 태평양전쟁피해자보상추진협의회, 한국원폭피해자협회 등</w:t>
       </w:r>
     </w:p>
     <w:p>
@@ -6716,7 +6261,7 @@
           <w:color w:val="2E4A87"/>
           <w:sz w:val="22"/>
         </w:rPr>
-        <w:t>3. 해외 협력</w:t>
+        <w:t>3. 국제 협력</w:t>
       </w:r>
     </w:p>
     <w:p>
@@ -6729,7 +6274,7 @@
           <w:rFonts w:ascii="맑은 고딕" w:hAnsi="맑은 고딕" w:eastAsia="맑은 고딕"/>
           <w:sz w:val="20"/>
         </w:rPr>
-        <w:t>□ 일본 시민단체·학술기관과 우선 협력합니다. (일본 정부 기관과의 직접 협력은 민감하므로 신중)</w:t>
+        <w:t>□ 일본 시민단체·학술기관 우선 협력 (일본 정부 기관 직접 협력은 민감성 고려 신중)</w:t>
       </w:r>
     </w:p>
     <w:p>
@@ -6755,7 +6300,7 @@
           <w:rFonts w:ascii="맑은 고딕" w:hAnsi="맑은 고딕" w:eastAsia="맑은 고딕"/>
           <w:sz w:val="20"/>
         </w:rPr>
-        <w:t>○ 그 외: 독일 EVZ재단(강제노동 자료관 운영 경험), 미국 USC 쇼아재단(구술 자료), ILO·UNESCO</w:t>
+        <w:t>○ 그 외: 독일 EVZ재단(강제노동 아카이브 운영 경험), 미국 USC 쇼아재단(구술 자료), ILO·UNESCO(국제 규범 자료)</w:t>
       </w:r>
     </w:p>
     <w:p>
@@ -6769,7 +6314,7 @@
           <w:color w:val="2E4A87"/>
           <w:sz w:val="22"/>
         </w:rPr>
-        <w:t>4. 민관 협력 자문위원회</w:t>
+        <w:t>4. 민관 협력 거버넌스</w:t>
       </w:r>
     </w:p>
     <w:p>
@@ -6782,7 +6327,7 @@
           <w:rFonts w:ascii="맑은 고딕" w:hAnsi="맑은 고딕" w:eastAsia="맑은 고딕"/>
           <w:sz w:val="20"/>
         </w:rPr>
-        <w:t>□ 역사·기술·법률 전문가와 피해자단체, 시민단체가 참여하는 자문위원회(13명)를 둡니다.</w:t>
+        <w:t>□ 역사·기술·법률 전문가와 피해자단체·시민단체가 참여하는 자문위원회(13명) 운영</w:t>
       </w:r>
     </w:p>
     <w:tbl>
@@ -7070,87 +6615,85 @@
           <w:rFonts w:ascii="맑은 고딕" w:hAnsi="맑은 고딕" w:eastAsia="맑은 고딕"/>
           <w:sz w:val="20"/>
         </w:rPr>
-        <w:t xml:space="preserve">□ </w:t>
+        <w:t>□ 과거사 정책의 통합 추진 기반 마련</w:t>
       </w:r>
-      <w:r>
-        <w:rPr>
-          <w:rFonts w:ascii="맑은 고딕" w:hAnsi="맑은 고딕" w:eastAsia="맑은 고딕"/>
-          <w:b/>
-          <w:sz w:val="20"/>
-        </w:rPr>
-        <w:t>과거사 정책의 통합 추진 기반 마련</w:t>
-      </w:r>
+    </w:p>
+    <w:p>
+      <w:pPr>
+        <w:spacing w:before="0" w:after="3" w:line="240" w:lineRule="auto"/>
+        <w:ind w:left="283"/>
+      </w:pPr>
       <w:r>
         <w:rPr>
           <w:rFonts w:ascii="맑은 고딕" w:hAnsi="맑은 고딕" w:eastAsia="맑은 고딕"/>
           <w:sz w:val="20"/>
         </w:rPr>
+        <w:t>○ 6개 부처에 분산된 업무·자료를 최초로 통합, 효율적·일관된 대응 가능</w:t>
       </w:r>
     </w:p>
     <w:p>
       <w:pPr>
         <w:spacing w:before="0" w:after="3" w:line="240" w:lineRule="auto"/>
-        <w:ind w:left="283"/>
+        <w:ind w:left="0"/>
       </w:pPr>
       <w:r>
         <w:rPr>
           <w:rFonts w:ascii="맑은 고딕" w:hAnsi="맑은 고딕" w:eastAsia="맑은 고딕"/>
           <w:sz w:val="20"/>
         </w:rPr>
-        <w:t>○ 6개 부처에 나뉜 업무·자료를 처음으로 통합해, 효율적이고 일관되게 대응할 수 있습니다.</w:t>
+        <w:t>□ 역사부정론 대응 실증 기반 확보</w:t>
       </w:r>
     </w:p>
     <w:p>
       <w:pPr>
         <w:spacing w:before="0" w:after="3" w:line="240" w:lineRule="auto"/>
-        <w:ind w:left="0"/>
+        <w:ind w:left="283"/>
       </w:pPr>
       <w:r>
         <w:rPr>
           <w:rFonts w:ascii="맑은 고딕" w:hAnsi="맑은 고딕" w:eastAsia="맑은 고딕"/>
           <w:sz w:val="20"/>
         </w:rPr>
-        <w:t xml:space="preserve">□ </w:t>
+        <w:t>○ 강제동원·위안부·독도를 가로지르는 증거 자료 통합으로 일본 부정 주장에 실증 대응</w:t>
       </w:r>
-      <w:r>
-        <w:rPr>
-          <w:rFonts w:ascii="맑은 고딕" w:hAnsi="맑은 고딕" w:eastAsia="맑은 고딕"/>
-          <w:b/>
-          <w:sz w:val="20"/>
-        </w:rPr>
-        <w:t>역사부정론 대응 실증 기반 확보</w:t>
-      </w:r>
+    </w:p>
+    <w:p>
+      <w:pPr>
+        <w:spacing w:before="0" w:after="3" w:line="240" w:lineRule="auto"/>
+        <w:ind w:left="283"/>
+      </w:pPr>
       <w:r>
         <w:rPr>
           <w:rFonts w:ascii="맑은 고딕" w:hAnsi="맑은 고딕" w:eastAsia="맑은 고딕"/>
           <w:sz w:val="20"/>
         </w:rPr>
+        <w:t>○ 유네스코 등재 등 국제 무대에서 근거 자료로 즉시 활용</w:t>
       </w:r>
     </w:p>
     <w:p>
       <w:pPr>
         <w:spacing w:before="0" w:after="3" w:line="240" w:lineRule="auto"/>
-        <w:ind w:left="283"/>
+        <w:ind w:left="0"/>
       </w:pPr>
       <w:r>
         <w:rPr>
           <w:rFonts w:ascii="맑은 고딕" w:hAnsi="맑은 고딕" w:eastAsia="맑은 고딕"/>
           <w:sz w:val="20"/>
         </w:rPr>
-        <w:t>○ 강제동원·위안부·독도를 가로지르는 증거 자료를 한곳에 모아, 일본의 부정 주장에</w:t>
+        <w:t>□ 사장된 국가 자료의 활용</w:t>
       </w:r>
     </w:p>
     <w:p>
       <w:pPr>
         <w:spacing w:before="0" w:after="3" w:line="240" w:lineRule="auto"/>
-        <w:ind w:left="0"/>
+        <w:ind w:left="283"/>
       </w:pPr>
       <w:r>
         <w:rPr>
           <w:rFonts w:ascii="맑은 고딕" w:hAnsi="맑은 고딕" w:eastAsia="맑은 고딕"/>
           <w:sz w:val="20"/>
         </w:rPr>
-        <w:t>사실로 맞섭니다. 유네스코 등재 같은 국제 무대에서 바로 활용합니다.</w:t>
+        <w:t>○ 미활용 강제동원 판정자료 22만 건을 연구·정책 자원으로 전환</w:t>
       </w:r>
     </w:p>
     <w:p>
@@ -7163,127 +6706,46 @@
           <w:rFonts w:ascii="맑은 고딕" w:hAnsi="맑은 고딕" w:eastAsia="맑은 고딕"/>
           <w:sz w:val="20"/>
         </w:rPr>
-        <w:t xml:space="preserve">□ </w:t>
+        <w:t>□ AI 시대 역사 해석 주도권 확보</w:t>
       </w:r>
-      <w:r>
-        <w:rPr>
-          <w:rFonts w:ascii="맑은 고딕" w:hAnsi="맑은 고딕" w:eastAsia="맑은 고딕"/>
-          <w:b/>
-          <w:sz w:val="20"/>
-        </w:rPr>
-        <w:t>사장된 국가 자료의 활용</w:t>
-      </w:r>
+    </w:p>
+    <w:p>
+      <w:pPr>
+        <w:spacing w:before="0" w:after="3" w:line="240" w:lineRule="auto"/>
+        <w:ind w:left="283"/>
+      </w:pPr>
       <w:r>
         <w:rPr>
           <w:rFonts w:ascii="맑은 고딕" w:hAnsi="맑은 고딕" w:eastAsia="맑은 고딕"/>
           <w:sz w:val="20"/>
         </w:rPr>
+        <w:t>○ 피해자 중심 자료를 AI 학습 데이터로 제공하여 AI 역사 서술에 한국 입장 반영</w:t>
       </w:r>
     </w:p>
     <w:p>
       <w:pPr>
         <w:spacing w:before="0" w:after="3" w:line="240" w:lineRule="auto"/>
-        <w:ind w:left="283"/>
+        <w:ind w:left="0"/>
       </w:pPr>
       <w:r>
         <w:rPr>
           <w:rFonts w:ascii="맑은 고딕" w:hAnsi="맑은 고딕" w:eastAsia="맑은 고딕"/>
           <w:sz w:val="20"/>
         </w:rPr>
-        <w:t>○ 활용하지 못하던 강제동원 판정자료 22만 건이 연구·정책에 쓰이게 됩니다.</w:t>
+        <w:t>□ 차세대 교육 및 한일 시민 연대 기반 구축</w:t>
       </w:r>
     </w:p>
     <w:p>
       <w:pPr>
         <w:spacing w:before="0" w:after="3" w:line="240" w:lineRule="auto"/>
-        <w:ind w:left="0"/>
+        <w:ind w:left="283"/>
       </w:pPr>
       <w:r>
         <w:rPr>
           <w:rFonts w:ascii="맑은 고딕" w:hAnsi="맑은 고딕" w:eastAsia="맑은 고딕"/>
           <w:sz w:val="20"/>
         </w:rPr>
-        <w:t xml:space="preserve">□ </w:t>
-      </w:r>
-      <w:r>
-        <w:rPr>
-          <w:rFonts w:ascii="맑은 고딕" w:hAnsi="맑은 고딕" w:eastAsia="맑은 고딕"/>
-          <w:b/>
-          <w:sz w:val="20"/>
-        </w:rPr>
-        <w:t>AI 시대 역사 해석 주도권 확보</w:t>
-      </w:r>
-      <w:r>
-        <w:rPr>
-          <w:rFonts w:ascii="맑은 고딕" w:hAnsi="맑은 고딕" w:eastAsia="맑은 고딕"/>
-          <w:sz w:val="20"/>
-        </w:rPr>
-      </w:r>
-    </w:p>
-    <w:p>
-      <w:pPr>
-        <w:spacing w:before="0" w:after="3" w:line="240" w:lineRule="auto"/>
-        <w:ind w:left="283"/>
-      </w:pPr>
-      <w:r>
-        <w:rPr>
-          <w:rFonts w:ascii="맑은 고딕" w:hAnsi="맑은 고딕" w:eastAsia="맑은 고딕"/>
-          <w:sz w:val="20"/>
-        </w:rPr>
-        <w:t>○ 우리 피해자 중심 자료를 AI가 배우게 해, AI가 한국 입장의 역사를 설명하도록 합니다.</w:t>
-      </w:r>
-    </w:p>
-    <w:p>
-      <w:pPr>
-        <w:spacing w:before="0" w:after="3" w:line="240" w:lineRule="auto"/>
-        <w:ind w:left="0"/>
-      </w:pPr>
-      <w:r>
-        <w:rPr>
-          <w:rFonts w:ascii="맑은 고딕" w:hAnsi="맑은 고딕" w:eastAsia="맑은 고딕"/>
-          <w:sz w:val="20"/>
-        </w:rPr>
-        <w:t xml:space="preserve">□ </w:t>
-      </w:r>
-      <w:r>
-        <w:rPr>
-          <w:rFonts w:ascii="맑은 고딕" w:hAnsi="맑은 고딕" w:eastAsia="맑은 고딕"/>
-          <w:b/>
-          <w:sz w:val="20"/>
-        </w:rPr>
-        <w:t>차세대 교육 및 한일 시민 연대 기반 구축</w:t>
-      </w:r>
-      <w:r>
-        <w:rPr>
-          <w:rFonts w:ascii="맑은 고딕" w:hAnsi="맑은 고딕" w:eastAsia="맑은 고딕"/>
-          <w:sz w:val="20"/>
-        </w:rPr>
-      </w:r>
-    </w:p>
-    <w:p>
-      <w:pPr>
-        <w:spacing w:before="0" w:after="3" w:line="240" w:lineRule="auto"/>
-        <w:ind w:left="283"/>
-      </w:pPr>
-      <w:r>
-        <w:rPr>
-          <w:rFonts w:ascii="맑은 고딕" w:hAnsi="맑은 고딕" w:eastAsia="맑은 고딕"/>
-          <w:sz w:val="20"/>
-        </w:rPr>
-        <w:t>○ 교과서·교육에 바로 쓰는 콘텐츠를 만들고, 한일 시민이 함께 만든 기록을 공유해</w:t>
-      </w:r>
-    </w:p>
-    <w:p>
-      <w:pPr>
-        <w:spacing w:before="0" w:after="3" w:line="240" w:lineRule="auto"/>
-        <w:ind w:left="0"/>
-      </w:pPr>
-      <w:r>
-        <w:rPr>
-          <w:rFonts w:ascii="맑은 고딕" w:hAnsi="맑은 고딕" w:eastAsia="맑은 고딕"/>
-          <w:sz w:val="20"/>
-        </w:rPr>
-        <w:t>역사 갈등을 넘는 연대의 기반을 닦습니다.</w:t>
+        <w:t>○ 교과서·교육 활용 콘텐츠 개발, 한일 시민 공동 생산 기록 공유로 역사 갈등을 넘는 연대 기반 강화</w:t>
       </w:r>
     </w:p>
     <w:p>
@@ -8939,7 +8401,7 @@
                 <w:rFonts w:ascii="맑은 고딕" w:hAnsi="맑은 고딕" w:eastAsia="맑은 고딕"/>
                 <w:sz w:val="18"/>
               </w:rPr>
-              <w:t>AI 통합 검색·다국어</w:t>
+              <w:t>AI 사안 횡단 검색·다국어</w:t>
             </w:r>
           </w:p>
         </w:tc>
@@ -9186,7 +8648,7 @@
                 <w:rFonts w:ascii="맑은 고딕" w:hAnsi="맑은 고딕" w:eastAsia="맑은 고딕"/>
                 <w:sz w:val="18"/>
               </w:rPr>
-              <w:t>OCR</w:t>
+              <w:t>사안 횡단 검색</w:t>
             </w:r>
           </w:p>
         </w:tc>
@@ -9204,7 +8666,7 @@
                 <w:rFonts w:ascii="맑은 고딕" w:hAnsi="맑은 고딕" w:eastAsia="맑은 고딕"/>
                 <w:sz w:val="18"/>
               </w:rPr>
-              <w:t>스캔한 사진·문서를 컴퓨터가 읽는 글자로 바꾸는 기술</w:t>
+              <w:t>분야 경계 없이 인물·사건 중심으로 관련 자료를 통합 검색하는 방식</w:t>
             </w:r>
           </w:p>
         </w:tc>
@@ -9225,7 +8687,7 @@
                 <w:rFonts w:ascii="맑은 고딕" w:hAnsi="맑은 고딕" w:eastAsia="맑은 고딕"/>
                 <w:sz w:val="18"/>
               </w:rPr>
-              <w:t>STT</w:t>
+              <w:t>OCR</w:t>
             </w:r>
           </w:p>
         </w:tc>
@@ -9244,7 +8706,7 @@
                 <w:rFonts w:ascii="맑은 고딕" w:hAnsi="맑은 고딕" w:eastAsia="맑은 고딕"/>
                 <w:sz w:val="18"/>
               </w:rPr>
-              <w:t>녹음된 음성을 글자로 바꾸는 받아쓰기 기술</w:t>
+              <w:t>스캔한 사진·문서를 컴퓨터가 읽는 글자로 바꾸는 기술</w:t>
             </w:r>
           </w:p>
         </w:tc>
@@ -9264,7 +8726,7 @@
                 <w:rFonts w:ascii="맑은 고딕" w:hAnsi="맑은 고딕" w:eastAsia="맑은 고딕"/>
                 <w:sz w:val="18"/>
               </w:rPr>
-              <w:t>온톨로지</w:t>
+              <w:t>STT</w:t>
             </w:r>
           </w:p>
         </w:tc>
@@ -9282,7 +8744,7 @@
                 <w:rFonts w:ascii="맑은 고딕" w:hAnsi="맑은 고딕" w:eastAsia="맑은 고딕"/>
                 <w:sz w:val="18"/>
               </w:rPr>
-              <w:t>자료들의 관계(누가-무엇을-어디서)를 컴퓨터가 이해하도록 정리한 지식 구조</w:t>
+              <w:t>녹음된 음성을 글자로 바꾸는 받아쓰기 기술</w:t>
             </w:r>
           </w:p>
         </w:tc>
@@ -9303,7 +8765,7 @@
                 <w:rFonts w:ascii="맑은 고딕" w:hAnsi="맑은 고딕" w:eastAsia="맑은 고딕"/>
                 <w:sz w:val="18"/>
               </w:rPr>
-              <w:t>지식 그래프</w:t>
+              <w:t>온톨로지</w:t>
             </w:r>
           </w:p>
         </w:tc>
@@ -9322,7 +8784,7 @@
                 <w:rFonts w:ascii="맑은 고딕" w:hAnsi="맑은 고딕" w:eastAsia="맑은 고딕"/>
                 <w:sz w:val="18"/>
               </w:rPr>
-              <w:t>인물·사건·자료를 선으로 이어 보여주는 관계도</w:t>
+              <w:t>자료들의 관계(누가-무엇을-어디서)를 컴퓨터가 이해하도록 정리한 지식 구조</w:t>
             </w:r>
           </w:p>
         </w:tc>
@@ -9342,7 +8804,7 @@
                 <w:rFonts w:ascii="맑은 고딕" w:hAnsi="맑은 고딕" w:eastAsia="맑은 고딕"/>
                 <w:sz w:val="18"/>
               </w:rPr>
-              <w:t>소버린 AI</w:t>
+              <w:t>지식 그래프</w:t>
             </w:r>
           </w:p>
         </w:tc>
@@ -9360,7 +8822,7 @@
                 <w:rFonts w:ascii="맑은 고딕" w:hAnsi="맑은 고딕" w:eastAsia="맑은 고딕"/>
                 <w:sz w:val="18"/>
               </w:rPr>
-              <w:t>자기 나라 데이터로 만든, 우리만의 AI</w:t>
+              <w:t>인물·사건·자료를 선으로 이어 보여주는 관계도</w:t>
             </w:r>
           </w:p>
         </w:tc>
@@ -9381,7 +8843,7 @@
                 <w:rFonts w:ascii="맑은 고딕" w:hAnsi="맑은 고딕" w:eastAsia="맑은 고딕"/>
                 <w:sz w:val="18"/>
               </w:rPr>
-              <w:t>메타데이터</w:t>
+              <w:t>소버린 AI</w:t>
             </w:r>
           </w:p>
         </w:tc>
@@ -9400,7 +8862,7 @@
                 <w:rFonts w:ascii="맑은 고딕" w:hAnsi="맑은 고딕" w:eastAsia="맑은 고딕"/>
                 <w:sz w:val="18"/>
               </w:rPr>
-              <w:t>자료에 붙이는 꼬리표 정보(누가·언제·어디서·무엇을)</w:t>
+              <w:t>자기 나라 데이터로 만든, 우리만의 AI</w:t>
             </w:r>
           </w:p>
         </w:tc>
@@ -9420,7 +8882,7 @@
                 <w:rFonts w:ascii="맑은 고딕" w:hAnsi="맑은 고딕" w:eastAsia="맑은 고딕"/>
                 <w:sz w:val="18"/>
               </w:rPr>
-              <w:t>G-Cloud</w:t>
+              <w:t>메타데이터</w:t>
             </w:r>
           </w:p>
         </w:tc>
@@ -9438,7 +8900,7 @@
                 <w:rFonts w:ascii="맑은 고딕" w:hAnsi="맑은 고딕" w:eastAsia="맑은 고딕"/>
                 <w:sz w:val="18"/>
               </w:rPr>
-              <w:t>정부가 운영하는 국내 클라우드(서버). 자료를 국내에 안전하게 보관</w:t>
+              <w:t>자료에 붙이는 꼬리표 정보(누가·언제·어디서·무엇을)</w:t>
             </w:r>
           </w:p>
         </w:tc>
@@ -9459,6 +8921,45 @@
                 <w:rFonts w:ascii="맑은 고딕" w:hAnsi="맑은 고딕" w:eastAsia="맑은 고딕"/>
                 <w:sz w:val="18"/>
               </w:rPr>
+              <w:t>G-Cloud</w:t>
+            </w:r>
+          </w:p>
+        </w:tc>
+        <w:tc>
+          <w:tcPr>
+            <w:tcW w:type="dxa" w:w="3969"/>
+            <w:vAlign w:val="center"/>
+            <w:shd w:val="clear" w:color="auto" w:fill="EEF2FA"/>
+          </w:tcPr>
+          <w:p>
+            <w:pPr>
+              <w:jc w:val="left"/>
+            </w:pPr>
+            <w:r>
+              <w:rPr>
+                <w:rFonts w:ascii="맑은 고딕" w:hAnsi="맑은 고딕" w:eastAsia="맑은 고딕"/>
+                <w:sz w:val="18"/>
+              </w:rPr>
+              <w:t>정부가 운영하는 국내 클라우드(서버). 자료를 국내에 안전하게 보관</w:t>
+            </w:r>
+          </w:p>
+        </w:tc>
+      </w:tr>
+      <w:tr>
+        <w:tc>
+          <w:tcPr>
+            <w:tcW w:type="dxa" w:w="3969"/>
+            <w:vAlign w:val="center"/>
+          </w:tcPr>
+          <w:p>
+            <w:pPr>
+              <w:jc w:val="left"/>
+            </w:pPr>
+            <w:r>
+              <w:rPr>
+                <w:rFonts w:ascii="맑은 고딕" w:hAnsi="맑은 고딕" w:eastAsia="맑은 고딕"/>
+                <w:sz w:val="18"/>
+              </w:rPr>
               <w:t>에고 기록물</w:t>
             </w:r>
           </w:p>
@@ -9467,7 +8968,6 @@
           <w:tcPr>
             <w:tcW w:type="dxa" w:w="3969"/>
             <w:vAlign w:val="center"/>
-            <w:shd w:val="clear" w:color="auto" w:fill="EEF2FA"/>
           </w:tcPr>
           <w:p>
             <w:pPr>
@@ -9522,7 +9022,7 @@
           <w:color w:val="2E4A87"/>
           <w:sz w:val="20"/>
         </w:rPr>
-        <w:t>본문 Ⅲ장의 기술적 세부 사항을 담았습니다. 실무 추진 시 참고용입니다.</w:t>
+        <w:t>본문 Ⅲ장의 기술적 세부 사항 수록. 실무 추진 시 참고용</w:t>
       </w:r>
     </w:p>
     <w:p>
@@ -9587,7 +9087,7 @@
           <w:rFonts w:ascii="맑은 고딕" w:hAnsi="맑은 고딕" w:eastAsia="맑은 고딕"/>
           <w:sz w:val="20"/>
         </w:rPr>
-        <w:t xml:space="preserve">  - 처리 원본은 항온항습(15~18℃, 습도 35~45%) 환경에 이관 보관</w:t>
+        <w:t xml:space="preserve">  - 처리 원본은 항온항습(15~18℃, 습도 35~45%) 환경 이관 보관</w:t>
       </w:r>
     </w:p>
     <w:p>
@@ -9600,46 +9100,20 @@
           <w:rFonts w:ascii="맑은 고딕" w:hAnsi="맑은 고딕" w:eastAsia="맑은 고딕"/>
           <w:sz w:val="20"/>
         </w:rPr>
-        <w:t>○ 문서 OCR: 고해상도 스캔(600dpi 이상) 후 다언어 OCR 적용. 일본어 필기체·변체한자는</w:t>
+        <w:t>○ 문서 OCR: 고해상도 스캔(600dpi 이상) 후 다언어 OCR 적용. 일본어 필기체·변체한자는 전용 모델 별도 구축(fine-tuning). OCR 후처리 전문가 교정 비용 별도 산정</w:t>
       </w:r>
     </w:p>
     <w:p>
       <w:pPr>
         <w:spacing w:before="0" w:after="3" w:line="240" w:lineRule="auto"/>
-        <w:ind w:left="0"/>
+        <w:ind w:left="283"/>
       </w:pPr>
       <w:r>
         <w:rPr>
           <w:rFonts w:ascii="맑은 고딕" w:hAnsi="맑은 고딕" w:eastAsia="맑은 고딕"/>
           <w:sz w:val="20"/>
         </w:rPr>
-        <w:t>전용 모델 별도 구축(fine-tuning). OCR 후처리 전문가 교정 비용 별도 산정</w:t>
-      </w:r>
-    </w:p>
-    <w:p>
-      <w:pPr>
-        <w:spacing w:before="0" w:after="3" w:line="240" w:lineRule="auto"/>
-        <w:ind w:left="283"/>
-      </w:pPr>
-      <w:r>
-        <w:rPr>
-          <w:rFonts w:ascii="맑은 고딕" w:hAnsi="맑은 고딕" w:eastAsia="맑은 고딕"/>
-          <w:sz w:val="20"/>
-        </w:rPr>
-        <w:t>○ 음성 STT: 한·일·방언 처리 가능 모델 적용 후 전문가 교정. 전사 텍스트는 AI 학습용</w:t>
-      </w:r>
-    </w:p>
-    <w:p>
-      <w:pPr>
-        <w:spacing w:before="0" w:after="3" w:line="240" w:lineRule="auto"/>
-        <w:ind w:left="0"/>
-      </w:pPr>
-      <w:r>
-        <w:rPr>
-          <w:rFonts w:ascii="맑은 고딕" w:hAnsi="맑은 고딕" w:eastAsia="맑은 고딕"/>
-          <w:sz w:val="20"/>
-        </w:rPr>
-        <w:t>공개 형식으로 병행 출력</w:t>
+        <w:t>○ 음성 STT: 한·일·방언 처리 가능 모델 적용 후 전문가 교정. 전사 텍스트는 AI 학습용 공개 형식 병행 출력</w:t>
       </w:r>
     </w:p>
     <w:p>

</xml_diff>